<commit_message>
add BMS source code and EKF SOC algorithm
</commit_message>
<xml_diff>
--- a/个人简历2-研究生.docx
+++ b/个人简历2-研究生.docx
@@ -184,23 +184,7 @@
           <w:sz w:val="20"/>
           <w:szCs w:val="20"/>
         </w:rPr>
-        <w:t>姓</w:t>
-      </w:r>
-      <w:r>
-        <w:rPr>
-          <w:rFonts w:asciiTheme="minorEastAsia" w:eastAsiaTheme="minorEastAsia" w:hAnsiTheme="minorEastAsia" w:cstheme="minorEastAsia" w:hint="eastAsia"/>
-          <w:sz w:val="20"/>
-          <w:szCs w:val="20"/>
-        </w:rPr>
-        <w:t xml:space="preserve">    </w:t>
-      </w:r>
-      <w:r>
-        <w:rPr>
-          <w:rFonts w:asciiTheme="minorEastAsia" w:eastAsiaTheme="minorEastAsia" w:hAnsiTheme="minorEastAsia" w:cstheme="minorEastAsia" w:hint="eastAsia"/>
-          <w:sz w:val="20"/>
-          <w:szCs w:val="20"/>
-        </w:rPr>
-        <w:t>名：邝悦</w:t>
+        <w:t>姓    名：邝悦</w:t>
       </w:r>
     </w:p>
     <w:p>
@@ -218,23 +202,7 @@
           <w:sz w:val="20"/>
           <w:szCs w:val="20"/>
         </w:rPr>
-        <w:t>籍</w:t>
-      </w:r>
-      <w:r>
-        <w:rPr>
-          <w:rFonts w:asciiTheme="minorEastAsia" w:eastAsiaTheme="minorEastAsia" w:hAnsiTheme="minorEastAsia" w:cstheme="minorEastAsia" w:hint="eastAsia"/>
-          <w:sz w:val="20"/>
-          <w:szCs w:val="20"/>
-        </w:rPr>
-        <w:t xml:space="preserve">    </w:t>
-      </w:r>
-      <w:r>
-        <w:rPr>
-          <w:rFonts w:asciiTheme="minorEastAsia" w:eastAsiaTheme="minorEastAsia" w:hAnsiTheme="minorEastAsia" w:cstheme="minorEastAsia" w:hint="eastAsia"/>
-          <w:sz w:val="20"/>
-          <w:szCs w:val="20"/>
-        </w:rPr>
-        <w:t>贯：湖南郴州</w:t>
+        <w:t>籍    贯：湖南郴州</w:t>
       </w:r>
     </w:p>
     <w:p>
@@ -262,23 +230,7 @@
           <w:sz w:val="20"/>
           <w:szCs w:val="20"/>
         </w:rPr>
-        <w:t xml:space="preserve">    </w:t>
-      </w:r>
-      <w:r>
-        <w:rPr>
-          <w:rFonts w:asciiTheme="minorEastAsia" w:eastAsiaTheme="minorEastAsia" w:hAnsiTheme="minorEastAsia" w:cstheme="minorEastAsia" w:hint="eastAsia"/>
-          <w:sz w:val="20"/>
-          <w:szCs w:val="20"/>
-        </w:rPr>
-        <w:t>箱：</w:t>
-      </w:r>
-      <w:r>
-        <w:rPr>
-          <w:rFonts w:asciiTheme="minorEastAsia" w:eastAsiaTheme="minorEastAsia" w:hAnsiTheme="minorEastAsia" w:cstheme="minorEastAsia" w:hint="eastAsia"/>
-          <w:sz w:val="20"/>
-          <w:szCs w:val="20"/>
-        </w:rPr>
-        <w:t>1</w:t>
+        <w:t xml:space="preserve">    箱：1</w:t>
       </w:r>
       <w:r>
         <w:rPr>
@@ -312,23 +264,7 @@
           <w:sz w:val="20"/>
           <w:szCs w:val="20"/>
         </w:rPr>
-        <w:t>电</w:t>
-      </w:r>
-      <w:r>
-        <w:rPr>
-          <w:rFonts w:asciiTheme="minorEastAsia" w:eastAsiaTheme="minorEastAsia" w:hAnsiTheme="minorEastAsia" w:cstheme="minorEastAsia" w:hint="eastAsia"/>
-          <w:sz w:val="20"/>
-          <w:szCs w:val="20"/>
-        </w:rPr>
-        <w:t xml:space="preserve">    </w:t>
-      </w:r>
-      <w:r>
-        <w:rPr>
-          <w:rFonts w:asciiTheme="minorEastAsia" w:eastAsiaTheme="minorEastAsia" w:hAnsiTheme="minorEastAsia" w:cstheme="minorEastAsia" w:hint="eastAsia"/>
-          <w:sz w:val="20"/>
-          <w:szCs w:val="20"/>
-        </w:rPr>
-        <w:t>话：</w:t>
+        <w:t>电    话：</w:t>
       </w:r>
       <w:r>
         <w:rPr>
@@ -343,7 +279,7 @@
       <w:pPr>
         <w:spacing w:line="360" w:lineRule="exact"/>
         <w:rPr>
-          <w:rFonts w:ascii="黑体" w:eastAsia="黑体" w:hAnsi="黑体" w:hint="eastAsia"/>
+          <w:rFonts w:ascii="黑体" w:eastAsia="黑体" w:hAnsi="黑体"/>
           <w:b/>
           <w:bCs/>
           <w:sz w:val="24"/>
@@ -368,7 +304,7 @@
           <w:sz w:val="24"/>
           <w:szCs w:val="24"/>
         </w:rPr>
-        <w:t>嵌入式软件工程师 / 储能 EMS 工程师</w:t>
+        <w:t>嵌入式软件工程师</w:t>
       </w:r>
     </w:p>
     <w:tbl>
@@ -413,25 +349,7 @@
                 <w:color w:val="538CD5"/>
                 <w:sz w:val="28"/>
               </w:rPr>
-              <w:t>IT</w:t>
-            </w:r>
-            <w:r>
-              <w:rPr>
-                <w:rFonts w:ascii="微软雅黑" w:eastAsia="微软雅黑" w:hAnsi="微软雅黑" w:cs="Times New Roman" w:hint="eastAsia"/>
-                <w:b/>
-                <w:color w:val="538CD5"/>
-                <w:sz w:val="28"/>
-              </w:rPr>
-              <w:t>技能</w:t>
-            </w:r>
-            <w:r>
-              <w:rPr>
-                <w:rFonts w:ascii="微软雅黑" w:eastAsia="微软雅黑" w:hAnsi="微软雅黑" w:cs="Times New Roman" w:hint="eastAsia"/>
-                <w:b/>
-                <w:color w:val="538CD5"/>
-                <w:sz w:val="28"/>
-              </w:rPr>
-              <w:t>:</w:t>
+              <w:t>IT技能:</w:t>
             </w:r>
           </w:p>
         </w:tc>
@@ -465,7 +383,7 @@
         </w:numPr>
         <w:ind w:firstLineChars="0"/>
         <w:rPr>
-          <w:rFonts w:asciiTheme="minorEastAsia" w:eastAsiaTheme="minorEastAsia" w:hAnsiTheme="minorEastAsia" w:cstheme="minorEastAsia" w:hint="eastAsia"/>
+          <w:rFonts w:asciiTheme="minorEastAsia" w:eastAsiaTheme="minorEastAsia" w:hAnsiTheme="minorEastAsia" w:cstheme="minorEastAsia"/>
           <w:sz w:val="20"/>
           <w:szCs w:val="20"/>
         </w:rPr>
@@ -506,18 +424,94 @@
         </w:numPr>
         <w:ind w:firstLineChars="0"/>
         <w:rPr>
-          <w:rFonts w:asciiTheme="minorEastAsia" w:eastAsiaTheme="minorEastAsia" w:hAnsiTheme="minorEastAsia" w:cstheme="minorEastAsia" w:hint="eastAsia"/>
-          <w:sz w:val="20"/>
-          <w:szCs w:val="20"/>
-        </w:rPr>
-      </w:pPr>
-      <w:r>
-        <w:rPr>
-          <w:rFonts w:asciiTheme="minorEastAsia" w:eastAsiaTheme="minorEastAsia" w:hAnsiTheme="minorEastAsia" w:cstheme="minorEastAsia" w:hint="eastAsia"/>
-          <w:sz w:val="20"/>
-          <w:szCs w:val="20"/>
-        </w:rPr>
-        <w:t>底层/工业总线：熟练Modbus RTU（RS485）和双通道Modbus TCP开发、CAN、SPI、I2C、UART 等通信协议。应用层网络协议：熟悉 HTTP/HTTPS、WebSocket，能够进行嵌入式 Web 服务对接或云端通信</w:t>
+          <w:rFonts w:asciiTheme="minorEastAsia" w:eastAsiaTheme="minorEastAsia" w:hAnsiTheme="minorEastAsia" w:cstheme="minorEastAsia"/>
+          <w:sz w:val="20"/>
+          <w:szCs w:val="20"/>
+        </w:rPr>
+      </w:pPr>
+      <w:r>
+        <w:rPr>
+          <w:rFonts w:asciiTheme="minorEastAsia" w:eastAsiaTheme="minorEastAsia" w:hAnsiTheme="minorEastAsia" w:cstheme="minorEastAsia" w:hint="eastAsia"/>
+          <w:sz w:val="20"/>
+          <w:szCs w:val="20"/>
+        </w:rPr>
+        <w:t>底层/工业总线：熟练Modbus RTU（RS485）和双通道Modbus TCP开发</w:t>
+      </w:r>
+      <w:r>
+        <w:rPr>
+          <w:rFonts w:asciiTheme="minorEastAsia" w:eastAsiaTheme="minorEastAsia" w:hAnsiTheme="minorEastAsia" w:cstheme="minorEastAsia" w:hint="eastAsia"/>
+          <w:sz w:val="20"/>
+          <w:szCs w:val="20"/>
+        </w:rPr>
+        <w:t>,</w:t>
+      </w:r>
+      <w:r>
+        <w:rPr>
+          <w:rFonts w:asciiTheme="minorEastAsia" w:eastAsiaTheme="minorEastAsia" w:hAnsiTheme="minorEastAsia" w:cstheme="minorEastAsia" w:hint="eastAsia"/>
+          <w:sz w:val="20"/>
+          <w:szCs w:val="20"/>
+        </w:rPr>
+        <w:t>应用层网络协议：熟</w:t>
+      </w:r>
+      <w:proofErr w:type="spellStart"/>
+      <w:r>
+        <w:rPr>
+          <w:rFonts w:asciiTheme="minorEastAsia" w:eastAsiaTheme="minorEastAsia" w:hAnsiTheme="minorEastAsia" w:cstheme="minorEastAsia" w:hint="eastAsia"/>
+          <w:sz w:val="20"/>
+          <w:szCs w:val="20"/>
+        </w:rPr>
+        <w:t>SocketCAN</w:t>
+      </w:r>
+      <w:proofErr w:type="spellEnd"/>
+      <w:r>
+        <w:rPr>
+          <w:rFonts w:asciiTheme="minorEastAsia" w:eastAsiaTheme="minorEastAsia" w:hAnsiTheme="minorEastAsia" w:cstheme="minorEastAsia" w:hint="eastAsia"/>
+          <w:sz w:val="20"/>
+          <w:szCs w:val="20"/>
+        </w:rPr>
+        <w:t>、Modbus RTU/TCP、</w:t>
+      </w:r>
+      <w:proofErr w:type="spellStart"/>
+      <w:r>
+        <w:rPr>
+          <w:rFonts w:asciiTheme="minorEastAsia" w:eastAsiaTheme="minorEastAsia" w:hAnsiTheme="minorEastAsia" w:cstheme="minorEastAsia" w:hint="eastAsia"/>
+          <w:sz w:val="20"/>
+          <w:szCs w:val="20"/>
+        </w:rPr>
+        <w:t>Paho</w:t>
+      </w:r>
+      <w:proofErr w:type="spellEnd"/>
+      <w:r>
+        <w:rPr>
+          <w:rFonts w:asciiTheme="minorEastAsia" w:eastAsiaTheme="minorEastAsia" w:hAnsiTheme="minorEastAsia" w:cstheme="minorEastAsia" w:hint="eastAsia"/>
+          <w:sz w:val="20"/>
+          <w:szCs w:val="20"/>
+        </w:rPr>
+        <w:t xml:space="preserve"> MQTT C、IEC 60870-5-104</w:t>
+      </w:r>
+      <w:r>
+        <w:rPr>
+          <w:rFonts w:asciiTheme="minorEastAsia" w:eastAsiaTheme="minorEastAsia" w:hAnsiTheme="minorEastAsia" w:cstheme="minorEastAsia"/>
+          <w:sz w:val="20"/>
+          <w:szCs w:val="20"/>
+        </w:rPr>
+        <w:t>/101</w:t>
+      </w:r>
+      <w:r>
+        <w:rPr>
+          <w:rFonts w:asciiTheme="minorEastAsia" w:eastAsiaTheme="minorEastAsia" w:hAnsiTheme="minorEastAsia" w:cstheme="minorEastAsia" w:hint="eastAsia"/>
+          <w:sz w:val="20"/>
+          <w:szCs w:val="20"/>
+        </w:rPr>
+        <w:t>等通信协议</w:t>
+      </w:r>
+      <w:r>
+        <w:rPr>
+          <w:rFonts w:asciiTheme="minorEastAsia" w:eastAsiaTheme="minorEastAsia" w:hAnsiTheme="minorEastAsia" w:cstheme="minorEastAsia" w:hint="eastAsia"/>
+          <w:sz w:val="20"/>
+          <w:szCs w:val="20"/>
+        </w:rPr>
+        <w:t>，能够进行嵌入式 Web 服务对接或云端通信</w:t>
       </w:r>
       <w:r>
         <w:rPr>
@@ -545,36 +539,44 @@
         </w:numPr>
         <w:ind w:firstLineChars="0"/>
         <w:rPr>
-          <w:rFonts w:asciiTheme="minorEastAsia" w:eastAsiaTheme="minorEastAsia" w:hAnsiTheme="minorEastAsia" w:cstheme="minorEastAsia" w:hint="eastAsia"/>
-          <w:sz w:val="20"/>
-          <w:szCs w:val="20"/>
-        </w:rPr>
-      </w:pPr>
-      <w:r>
-        <w:rPr>
-          <w:rFonts w:asciiTheme="minorEastAsia" w:eastAsiaTheme="minorEastAsia" w:hAnsiTheme="minorEastAsia" w:cstheme="minorEastAsia" w:hint="eastAsia"/>
-          <w:sz w:val="20"/>
-          <w:szCs w:val="20"/>
-        </w:rPr>
-        <w:t xml:space="preserve">系统移植与驱动开发：具备硬件平台的 Linux 系统移植、设备树（DTS）配置与驱动开发经验；熟练进行 </w:t>
-      </w:r>
-      <w:proofErr w:type="spellStart"/>
-      <w:r>
-        <w:rPr>
-          <w:rFonts w:asciiTheme="minorEastAsia" w:eastAsiaTheme="minorEastAsia" w:hAnsiTheme="minorEastAsia" w:cstheme="minorEastAsia" w:hint="eastAsia"/>
-          <w:sz w:val="20"/>
-          <w:szCs w:val="20"/>
-        </w:rPr>
-        <w:t>FreeRTOS</w:t>
-      </w:r>
-      <w:proofErr w:type="spellEnd"/>
-      <w:r>
-        <w:rPr>
-          <w:rFonts w:asciiTheme="minorEastAsia" w:eastAsiaTheme="minorEastAsia" w:hAnsiTheme="minorEastAsia" w:cstheme="minorEastAsia" w:hint="eastAsia"/>
-          <w:sz w:val="20"/>
-          <w:szCs w:val="20"/>
-        </w:rPr>
-        <w:t xml:space="preserve"> 实时操作系统的裁剪、多任务调度调优及基于队列/信号量的任务间同步隔离。</w:t>
+          <w:rFonts w:asciiTheme="minorEastAsia" w:eastAsiaTheme="minorEastAsia" w:hAnsiTheme="minorEastAsia" w:cstheme="minorEastAsia"/>
+          <w:sz w:val="20"/>
+          <w:szCs w:val="20"/>
+        </w:rPr>
+      </w:pPr>
+      <w:r>
+        <w:rPr>
+          <w:rFonts w:asciiTheme="minorEastAsia" w:eastAsiaTheme="minorEastAsia" w:hAnsiTheme="minorEastAsia" w:cstheme="minorEastAsia" w:hint="eastAsia"/>
+          <w:sz w:val="20"/>
+          <w:szCs w:val="20"/>
+        </w:rPr>
+        <w:t>熟悉储能EMS系统架构与能量控制策略</w:t>
+      </w:r>
+      <w:r>
+        <w:rPr>
+          <w:rFonts w:asciiTheme="minorEastAsia" w:eastAsiaTheme="minorEastAsia" w:hAnsiTheme="minorEastAsia" w:cstheme="minorEastAsia" w:hint="eastAsia"/>
+          <w:sz w:val="20"/>
+          <w:szCs w:val="20"/>
+        </w:rPr>
+        <w:t>：</w:t>
+      </w:r>
+      <w:proofErr w:type="gramStart"/>
+      <w:r>
+        <w:rPr>
+          <w:rFonts w:asciiTheme="minorEastAsia" w:eastAsiaTheme="minorEastAsia" w:hAnsiTheme="minorEastAsia" w:cstheme="minorEastAsia" w:hint="eastAsia"/>
+          <w:sz w:val="20"/>
+          <w:szCs w:val="20"/>
+        </w:rPr>
+        <w:t>熟悉光储充系统</w:t>
+      </w:r>
+      <w:proofErr w:type="gramEnd"/>
+      <w:r>
+        <w:rPr>
+          <w:rFonts w:asciiTheme="minorEastAsia" w:eastAsiaTheme="minorEastAsia" w:hAnsiTheme="minorEastAsia" w:cstheme="minorEastAsia" w:hint="eastAsia"/>
+          <w:sz w:val="20"/>
+          <w:szCs w:val="20"/>
+        </w:rPr>
+        <w:t>拓扑、PCC 功率闭环、防逆流、防过载、多 PCS 功率分配、功率爬坡及基于时段计划与 SOC 门限的充放电调度。</w:t>
       </w:r>
     </w:p>
     <w:p>
@@ -586,7 +588,7 @@
         </w:numPr>
         <w:ind w:firstLineChars="0"/>
         <w:rPr>
-          <w:rFonts w:asciiTheme="minorEastAsia" w:eastAsiaTheme="minorEastAsia" w:hAnsiTheme="minorEastAsia" w:cstheme="minorEastAsia" w:hint="eastAsia"/>
+          <w:rFonts w:asciiTheme="minorEastAsia" w:eastAsiaTheme="minorEastAsia" w:hAnsiTheme="minorEastAsia" w:cstheme="minorEastAsia"/>
           <w:sz w:val="20"/>
           <w:szCs w:val="20"/>
         </w:rPr>
@@ -772,16 +774,7 @@
                 <w:color w:val="538CD5"/>
                 <w:sz w:val="28"/>
               </w:rPr>
-              <w:t>经历</w:t>
-            </w:r>
-            <w:r>
-              <w:rPr>
-                <w:rFonts w:ascii="微软雅黑" w:eastAsia="微软雅黑" w:hAnsi="微软雅黑" w:cs="Times New Roman" w:hint="eastAsia"/>
-                <w:b/>
-                <w:color w:val="538CD5"/>
-                <w:sz w:val="28"/>
-              </w:rPr>
-              <w:t>:</w:t>
+              <w:t>经历:</w:t>
             </w:r>
           </w:p>
         </w:tc>
@@ -831,7 +824,7 @@
           <w:kern w:val="0"/>
           <w:szCs w:val="21"/>
         </w:rPr>
-        <w:t xml:space="preserve">2023年9月 </w:t>
+        <w:t>202</w:t>
       </w:r>
       <w:r>
         <w:rPr>
@@ -841,6 +834,36 @@
           <w:kern w:val="0"/>
           <w:szCs w:val="21"/>
         </w:rPr>
+        <w:t>4</w:t>
+      </w:r>
+      <w:r>
+        <w:rPr>
+          <w:rFonts w:ascii="微软雅黑" w:eastAsia="微软雅黑" w:hAnsi="微软雅黑" w:cs="微软雅黑" w:hint="eastAsia"/>
+          <w:b/>
+          <w:bCs/>
+          <w:kern w:val="0"/>
+          <w:szCs w:val="21"/>
+        </w:rPr>
+        <w:t>.0</w:t>
+      </w:r>
+      <w:r>
+        <w:rPr>
+          <w:rFonts w:ascii="微软雅黑" w:eastAsia="微软雅黑" w:hAnsi="微软雅黑" w:cs="微软雅黑"/>
+          <w:b/>
+          <w:bCs/>
+          <w:kern w:val="0"/>
+          <w:szCs w:val="21"/>
+        </w:rPr>
+        <w:t>3</w:t>
+      </w:r>
+      <w:r>
+        <w:rPr>
+          <w:rFonts w:ascii="微软雅黑" w:eastAsia="微软雅黑" w:hAnsi="微软雅黑" w:cs="微软雅黑"/>
+          <w:b/>
+          <w:bCs/>
+          <w:kern w:val="0"/>
+          <w:szCs w:val="21"/>
+        </w:rPr>
         <w:t>–</w:t>
       </w:r>
       <w:r>
@@ -851,7 +874,17 @@
           <w:kern w:val="0"/>
           <w:szCs w:val="21"/>
         </w:rPr>
-        <w:t xml:space="preserve"> 2024年</w:t>
+        <w:t xml:space="preserve"> 2024</w:t>
+      </w:r>
+      <w:r>
+        <w:rPr>
+          <w:rFonts w:ascii="微软雅黑" w:eastAsia="微软雅黑" w:hAnsi="微软雅黑" w:cs="微软雅黑" w:hint="eastAsia"/>
+          <w:b/>
+          <w:bCs/>
+          <w:kern w:val="0"/>
+          <w:szCs w:val="21"/>
+        </w:rPr>
+        <w:t>.</w:t>
       </w:r>
       <w:r>
         <w:rPr>
@@ -861,6 +894,16 @@
           <w:kern w:val="0"/>
           <w:szCs w:val="21"/>
         </w:rPr>
+        <w:t>0</w:t>
+      </w:r>
+      <w:r>
+        <w:rPr>
+          <w:rFonts w:ascii="微软雅黑" w:eastAsia="微软雅黑" w:hAnsi="微软雅黑" w:cs="微软雅黑"/>
+          <w:b/>
+          <w:bCs/>
+          <w:kern w:val="0"/>
+          <w:szCs w:val="21"/>
+        </w:rPr>
         <w:t>7</w:t>
       </w:r>
       <w:r>
@@ -871,7 +914,17 @@
           <w:kern w:val="0"/>
           <w:szCs w:val="21"/>
         </w:rPr>
-        <w:t>月</w:t>
+        <w:t xml:space="preserve"> </w:t>
+      </w:r>
+      <w:r>
+        <w:rPr>
+          <w:rFonts w:ascii="微软雅黑" w:eastAsia="微软雅黑" w:hAnsi="微软雅黑" w:cs="微软雅黑"/>
+          <w:b/>
+          <w:bCs/>
+          <w:kern w:val="0"/>
+          <w:szCs w:val="21"/>
+        </w:rPr>
+        <w:t xml:space="preserve">   </w:t>
       </w:r>
       <w:r>
         <w:rPr>
@@ -891,6 +944,15 @@
         </w:rPr>
         <w:t xml:space="preserve">   </w:t>
       </w:r>
+      <w:bookmarkStart w:id="0" w:name="OLE_LINK6"/>
+      <w:r>
+        <w:rPr>
+          <w:rFonts w:ascii="微软雅黑" w:eastAsia="微软雅黑" w:hAnsi="微软雅黑" w:cs="微软雅黑"/>
+          <w:kern w:val="0"/>
+          <w:szCs w:val="21"/>
+        </w:rPr>
+        <w:t xml:space="preserve">     </w:t>
+      </w:r>
       <w:r>
         <w:rPr>
           <w:rFonts w:ascii="微软雅黑" w:eastAsia="微软雅黑" w:hAnsi="微软雅黑" w:cs="微软雅黑" w:hint="eastAsia"/>
@@ -911,6 +973,7 @@
         </w:rPr>
         <w:t>有限公司</w:t>
       </w:r>
+      <w:bookmarkEnd w:id="0"/>
       <w:r>
         <w:rPr>
           <w:rFonts w:ascii="微软雅黑" w:eastAsia="微软雅黑" w:hAnsi="微软雅黑" w:cs="微软雅黑"/>
@@ -943,16 +1006,6 @@
       </w:r>
       <w:r>
         <w:rPr>
-          <w:rFonts w:ascii="微软雅黑" w:eastAsia="微软雅黑" w:hAnsi="微软雅黑" w:cs="微软雅黑" w:hint="eastAsia"/>
-          <w:b/>
-          <w:bCs/>
-          <w:kern w:val="0"/>
-          <w:szCs w:val="21"/>
-        </w:rPr>
-        <w:t>实习</w:t>
-      </w:r>
-      <w:r>
-        <w:rPr>
           <w:rFonts w:ascii="微软雅黑" w:eastAsia="微软雅黑" w:hAnsi="微软雅黑" w:cs="微软雅黑"/>
           <w:b/>
           <w:bCs/>
@@ -960,7 +1013,6 @@
           <w:szCs w:val="21"/>
         </w:rPr>
         <w:tab/>
-        <w:t xml:space="preserve">   </w:t>
       </w:r>
       <w:r>
         <w:rPr>
@@ -970,17 +1022,17 @@
           <w:kern w:val="0"/>
           <w:szCs w:val="21"/>
         </w:rPr>
+        <w:t xml:space="preserve">    </w:t>
+      </w:r>
+      <w:r>
+        <w:rPr>
+          <w:rFonts w:ascii="微软雅黑" w:eastAsia="微软雅黑" w:hAnsi="微软雅黑" w:cs="微软雅黑"/>
+          <w:b/>
+          <w:bCs/>
+          <w:kern w:val="0"/>
+          <w:szCs w:val="21"/>
+        </w:rPr>
         <w:t xml:space="preserve"> </w:t>
-      </w:r>
-      <w:r>
-        <w:rPr>
-          <w:rFonts w:ascii="微软雅黑" w:eastAsia="微软雅黑" w:hAnsi="微软雅黑" w:cs="微软雅黑"/>
-          <w:b/>
-          <w:bCs/>
-          <w:kern w:val="0"/>
-          <w:szCs w:val="21"/>
-        </w:rPr>
-        <w:t xml:space="preserve">   </w:t>
       </w:r>
       <w:r>
         <w:rPr>
@@ -1040,6 +1092,42 @@
         </w:rPr>
         <w:t>平台的BMS开发</w:t>
       </w:r>
+      <w:r>
+        <w:rPr>
+          <w:rFonts w:asciiTheme="minorEastAsia" w:eastAsiaTheme="minorEastAsia" w:hAnsiTheme="minorEastAsia" w:cstheme="minorEastAsia" w:hint="eastAsia"/>
+          <w:b/>
+          <w:bCs/>
+          <w:kern w:val="0"/>
+          <w:szCs w:val="21"/>
+        </w:rPr>
+        <w:t>：</w:t>
+      </w:r>
+      <w:r>
+        <w:rPr>
+          <w:rFonts w:asciiTheme="minorEastAsia" w:eastAsiaTheme="minorEastAsia" w:hAnsiTheme="minorEastAsia" w:cstheme="minorEastAsia" w:hint="eastAsia"/>
+          <w:kern w:val="0"/>
+          <w:szCs w:val="21"/>
+        </w:rPr>
+        <w:t>分析</w:t>
+      </w:r>
+      <w:proofErr w:type="gramStart"/>
+      <w:r>
+        <w:rPr>
+          <w:rFonts w:asciiTheme="minorEastAsia" w:eastAsiaTheme="minorEastAsia" w:hAnsiTheme="minorEastAsia" w:cstheme="minorEastAsia" w:hint="eastAsia"/>
+          <w:kern w:val="0"/>
+          <w:szCs w:val="21"/>
+        </w:rPr>
+        <w:t>安时</w:t>
+      </w:r>
+      <w:proofErr w:type="gramEnd"/>
+      <w:r>
+        <w:rPr>
+          <w:rFonts w:asciiTheme="minorEastAsia" w:eastAsiaTheme="minorEastAsia" w:hAnsiTheme="minorEastAsia" w:cstheme="minorEastAsia" w:hint="eastAsia"/>
+          <w:kern w:val="0"/>
+          <w:szCs w:val="21"/>
+        </w:rPr>
+        <w:t>积分法在电流采样零偏下的累计误差问题，学习卡尔曼滤波用于 SOC 融合估算的基本思路，梳理采样误差、状态修正与估算精度之间的关系。</w:t>
+      </w:r>
     </w:p>
     <w:p>
       <w:pPr>
@@ -1049,65 +1137,11 @@
         </w:numPr>
         <w:spacing w:line="360" w:lineRule="exact"/>
         <w:rPr>
-          <w:rFonts w:ascii="微软雅黑" w:eastAsia="微软雅黑" w:hAnsi="微软雅黑" w:cs="微软雅黑"/>
-        </w:rPr>
-      </w:pPr>
-      <w:r>
-        <w:rPr>
-          <w:rFonts w:asciiTheme="minorEastAsia" w:eastAsiaTheme="minorEastAsia" w:hAnsiTheme="minorEastAsia" w:cstheme="minorEastAsia" w:hint="eastAsia"/>
-          <w:b/>
-          <w:bCs/>
-          <w:kern w:val="0"/>
-          <w:szCs w:val="21"/>
-        </w:rPr>
-        <w:t>SOC算法研读</w:t>
-      </w:r>
-      <w:r>
-        <w:rPr>
-          <w:rFonts w:asciiTheme="minorEastAsia" w:eastAsiaTheme="minorEastAsia" w:hAnsiTheme="minorEastAsia" w:cstheme="minorEastAsia" w:hint="eastAsia"/>
-          <w:b/>
-          <w:bCs/>
-          <w:kern w:val="0"/>
-          <w:szCs w:val="21"/>
-        </w:rPr>
-        <w:t>：</w:t>
-      </w:r>
-      <w:r>
-        <w:rPr>
-          <w:rFonts w:asciiTheme="minorEastAsia" w:eastAsiaTheme="minorEastAsia" w:hAnsiTheme="minorEastAsia" w:cstheme="minorEastAsia" w:hint="eastAsia"/>
-          <w:kern w:val="0"/>
-          <w:szCs w:val="21"/>
-        </w:rPr>
-        <w:t>分析</w:t>
-      </w:r>
-      <w:proofErr w:type="gramStart"/>
-      <w:r>
-        <w:rPr>
-          <w:rFonts w:asciiTheme="minorEastAsia" w:eastAsiaTheme="minorEastAsia" w:hAnsiTheme="minorEastAsia" w:cstheme="minorEastAsia" w:hint="eastAsia"/>
-          <w:kern w:val="0"/>
-          <w:szCs w:val="21"/>
-        </w:rPr>
-        <w:t>安时</w:t>
-      </w:r>
-      <w:proofErr w:type="gramEnd"/>
-      <w:r>
-        <w:rPr>
-          <w:rFonts w:asciiTheme="minorEastAsia" w:eastAsiaTheme="minorEastAsia" w:hAnsiTheme="minorEastAsia" w:cstheme="minorEastAsia" w:hint="eastAsia"/>
-          <w:kern w:val="0"/>
-          <w:szCs w:val="21"/>
-        </w:rPr>
-        <w:t>积分法在电流采样零偏下的累计误差问题，学习卡尔曼滤波用于 SOC 融合估算的基本思路，梳理采样误差、状态修正与估算精度之间的关系。</w:t>
-      </w:r>
-    </w:p>
-    <w:p>
-      <w:pPr>
-        <w:numPr>
-          <w:ilvl w:val="0"/>
-          <w:numId w:val="2"/>
-        </w:numPr>
-        <w:spacing w:line="360" w:lineRule="exact"/>
-        <w:rPr>
-          <w:rFonts w:ascii="微软雅黑" w:eastAsia="微软雅黑" w:hAnsi="微软雅黑" w:cs="微软雅黑"/>
+          <w:rFonts w:asciiTheme="minorEastAsia" w:eastAsiaTheme="minorEastAsia" w:hAnsiTheme="minorEastAsia" w:cstheme="minorEastAsia"/>
+          <w:b/>
+          <w:bCs/>
+          <w:kern w:val="0"/>
+          <w:szCs w:val="21"/>
         </w:rPr>
       </w:pPr>
       <w:r>
@@ -1126,7 +1160,7 @@
           <w:kern w:val="0"/>
           <w:szCs w:val="21"/>
         </w:rPr>
-        <w:t xml:space="preserve">研读基于 NXP MCU 与 </w:t>
+        <w:t xml:space="preserve">基于 NXP MCU 与 </w:t>
       </w:r>
       <w:proofErr w:type="spellStart"/>
       <w:r>
@@ -1161,7 +1195,7 @@
       <w:pPr>
         <w:spacing w:line="0" w:lineRule="atLeast"/>
         <w:rPr>
-          <w:rFonts w:ascii="微软雅黑" w:eastAsia="微软雅黑" w:hAnsi="微软雅黑" w:hint="eastAsia"/>
+          <w:rFonts w:ascii="微软雅黑" w:eastAsia="微软雅黑" w:hAnsi="微软雅黑"/>
           <w:sz w:val="2"/>
           <w:szCs w:val="2"/>
         </w:rPr>
@@ -1218,7 +1252,7 @@
                 <w:color w:val="538CD5"/>
                 <w:sz w:val="28"/>
               </w:rPr>
-              <w:t>项目经历</w:t>
+              <w:t>工作</w:t>
             </w:r>
             <w:r>
               <w:rPr>
@@ -1227,7 +1261,7 @@
                 <w:color w:val="538CD5"/>
                 <w:sz w:val="28"/>
               </w:rPr>
-              <w:t>:</w:t>
+              <w:t>经历:</w:t>
             </w:r>
           </w:p>
         </w:tc>
@@ -1269,7 +1303,7 @@
           <w:szCs w:val="21"/>
         </w:rPr>
       </w:pPr>
-      <w:bookmarkStart w:id="0" w:name="_Hlk137998609"/>
+      <w:bookmarkStart w:id="1" w:name="_Hlk137998609"/>
       <w:r>
         <w:rPr>
           <w:rFonts w:ascii="微软雅黑" w:eastAsia="微软雅黑" w:hAnsi="微软雅黑" w:cs="微软雅黑"/>
@@ -1298,7 +1332,7 @@
           <w:kern w:val="0"/>
           <w:szCs w:val="21"/>
         </w:rPr>
-        <w:t>.09</w:t>
+        <w:t>.0</w:t>
       </w:r>
       <w:r>
         <w:rPr>
@@ -1308,6 +1342,16 @@
           <w:kern w:val="0"/>
           <w:szCs w:val="21"/>
         </w:rPr>
+        <w:t>7</w:t>
+      </w:r>
+      <w:r>
+        <w:rPr>
+          <w:rFonts w:ascii="微软雅黑" w:eastAsia="微软雅黑" w:hAnsi="微软雅黑" w:cs="微软雅黑"/>
+          <w:b/>
+          <w:bCs/>
+          <w:kern w:val="0"/>
+          <w:szCs w:val="21"/>
+        </w:rPr>
         <w:t>-</w:t>
       </w:r>
       <w:r>
@@ -1360,14 +1404,14 @@
         </w:rPr>
         <w:t xml:space="preserve">  </w:t>
       </w:r>
-      <w:bookmarkEnd w:id="0"/>
+      <w:bookmarkEnd w:id="1"/>
       <w:r>
         <w:rPr>
           <w:rFonts w:ascii="微软雅黑" w:eastAsia="微软雅黑" w:hAnsi="微软雅黑" w:cs="微软雅黑" w:hint="eastAsia"/>
           <w:kern w:val="0"/>
           <w:szCs w:val="21"/>
         </w:rPr>
-        <w:t xml:space="preserve">                       </w:t>
+        <w:t xml:space="preserve">      </w:t>
       </w:r>
       <w:r>
         <w:rPr>
@@ -1375,7 +1419,25 @@
           <w:kern w:val="0"/>
           <w:szCs w:val="21"/>
         </w:rPr>
-        <w:tab/>
+        <w:t xml:space="preserve">       </w:t>
+      </w:r>
+      <w:r>
+        <w:rPr>
+          <w:rFonts w:ascii="微软雅黑" w:eastAsia="微软雅黑" w:hAnsi="微软雅黑" w:cs="微软雅黑" w:hint="eastAsia"/>
+          <w:b/>
+          <w:bCs/>
+          <w:kern w:val="0"/>
+          <w:szCs w:val="21"/>
+        </w:rPr>
+        <w:t>深圳英飞源技术有限公司</w:t>
+      </w:r>
+      <w:r>
+        <w:rPr>
+          <w:rFonts w:ascii="微软雅黑" w:eastAsia="微软雅黑" w:hAnsi="微软雅黑" w:cs="微软雅黑" w:hint="eastAsia"/>
+          <w:kern w:val="0"/>
+          <w:szCs w:val="21"/>
+        </w:rPr>
+        <w:t xml:space="preserve">     </w:t>
       </w:r>
       <w:r>
         <w:rPr>
@@ -1383,56 +1445,7 @@
           <w:kern w:val="0"/>
           <w:szCs w:val="21"/>
         </w:rPr>
-        <w:tab/>
-      </w:r>
-      <w:r>
-        <w:rPr>
-          <w:rFonts w:ascii="微软雅黑" w:eastAsia="微软雅黑" w:hAnsi="微软雅黑" w:cs="微软雅黑"/>
-          <w:kern w:val="0"/>
-          <w:szCs w:val="21"/>
-        </w:rPr>
-        <w:tab/>
-      </w:r>
-      <w:r>
-        <w:rPr>
-          <w:rFonts w:ascii="微软雅黑" w:eastAsia="微软雅黑" w:hAnsi="微软雅黑" w:cs="微软雅黑"/>
-          <w:kern w:val="0"/>
-          <w:szCs w:val="21"/>
-        </w:rPr>
-        <w:tab/>
-      </w:r>
-      <w:r>
-        <w:rPr>
-          <w:rFonts w:ascii="微软雅黑" w:eastAsia="微软雅黑" w:hAnsi="微软雅黑" w:cs="微软雅黑"/>
-          <w:kern w:val="0"/>
-          <w:szCs w:val="21"/>
-        </w:rPr>
-        <w:tab/>
-      </w:r>
-      <w:r>
-        <w:rPr>
-          <w:rFonts w:ascii="微软雅黑" w:eastAsia="微软雅黑" w:hAnsi="微软雅黑" w:cs="微软雅黑"/>
-          <w:kern w:val="0"/>
-          <w:szCs w:val="21"/>
-        </w:rPr>
-        <w:tab/>
-      </w:r>
-      <w:r>
-        <w:rPr>
-          <w:rFonts w:ascii="微软雅黑" w:eastAsia="微软雅黑" w:hAnsi="微软雅黑" w:cs="微软雅黑"/>
-          <w:kern w:val="0"/>
-          <w:szCs w:val="21"/>
-        </w:rPr>
-        <w:tab/>
-        <w:t xml:space="preserve"> </w:t>
-      </w:r>
-      <w:r>
-        <w:rPr>
-          <w:rFonts w:ascii="微软雅黑" w:eastAsia="微软雅黑" w:hAnsi="微软雅黑" w:cs="微软雅黑"/>
-          <w:kern w:val="0"/>
-          <w:szCs w:val="21"/>
-        </w:rPr>
-        <w:t xml:space="preserve">    </w:t>
+        <w:t xml:space="preserve">              </w:t>
       </w:r>
       <w:r>
         <w:rPr>
@@ -1456,145 +1469,49 @@
           <w:szCs w:val="21"/>
         </w:rPr>
       </w:pPr>
-      <w:bookmarkStart w:id="1" w:name="OLE_LINK3"/>
-      <w:r>
-        <w:rPr>
-          <w:rFonts w:asciiTheme="minorEastAsia" w:eastAsiaTheme="minorEastAsia" w:hAnsiTheme="minorEastAsia" w:cstheme="minorEastAsia" w:hint="eastAsia"/>
-          <w:b/>
-          <w:bCs/>
-          <w:kern w:val="0"/>
-          <w:szCs w:val="21"/>
-        </w:rPr>
-        <w:t>技术</w:t>
-      </w:r>
-      <w:proofErr w:type="gramStart"/>
-      <w:r>
-        <w:rPr>
-          <w:rFonts w:asciiTheme="minorEastAsia" w:eastAsiaTheme="minorEastAsia" w:hAnsiTheme="minorEastAsia" w:cstheme="minorEastAsia" w:hint="eastAsia"/>
-          <w:b/>
-          <w:bCs/>
-          <w:kern w:val="0"/>
-          <w:szCs w:val="21"/>
-        </w:rPr>
-        <w:t>栈</w:t>
-      </w:r>
-      <w:proofErr w:type="gramEnd"/>
-      <w:r>
-        <w:rPr>
-          <w:rFonts w:asciiTheme="minorEastAsia" w:eastAsiaTheme="minorEastAsia" w:hAnsiTheme="minorEastAsia" w:cstheme="minorEastAsia" w:hint="eastAsia"/>
-          <w:b/>
-          <w:bCs/>
-          <w:kern w:val="0"/>
-          <w:szCs w:val="21"/>
-        </w:rPr>
-        <w:t>：</w:t>
-      </w:r>
-      <w:r>
-        <w:rPr>
-          <w:rFonts w:asciiTheme="minorEastAsia" w:eastAsiaTheme="minorEastAsia" w:hAnsiTheme="minorEastAsia" w:cstheme="minorEastAsia"/>
-          <w:kern w:val="0"/>
-          <w:szCs w:val="21"/>
-        </w:rPr>
-        <w:t>ARM Linux /</w:t>
-      </w:r>
-      <w:r>
-        <w:rPr>
-          <w:rFonts w:asciiTheme="minorEastAsia" w:eastAsiaTheme="minorEastAsia" w:hAnsiTheme="minorEastAsia" w:cstheme="minorEastAsia"/>
-          <w:kern w:val="0"/>
-          <w:szCs w:val="21"/>
-        </w:rPr>
-        <w:t xml:space="preserve"> </w:t>
-      </w:r>
-      <w:r>
-        <w:rPr>
-          <w:rFonts w:asciiTheme="minorEastAsia" w:eastAsiaTheme="minorEastAsia" w:hAnsiTheme="minorEastAsia" w:cstheme="minorEastAsia"/>
-          <w:kern w:val="0"/>
-          <w:szCs w:val="21"/>
-        </w:rPr>
-        <w:t xml:space="preserve">C / Modbus RTU/TCP / </w:t>
-      </w:r>
-      <w:proofErr w:type="spellStart"/>
-      <w:r>
-        <w:rPr>
-          <w:rFonts w:asciiTheme="minorEastAsia" w:eastAsiaTheme="minorEastAsia" w:hAnsiTheme="minorEastAsia" w:cstheme="minorEastAsia"/>
-          <w:kern w:val="0"/>
-          <w:szCs w:val="21"/>
-        </w:rPr>
-        <w:t>SocketCAN</w:t>
-      </w:r>
-      <w:proofErr w:type="spellEnd"/>
-      <w:r>
-        <w:rPr>
-          <w:rFonts w:asciiTheme="minorEastAsia" w:eastAsiaTheme="minorEastAsia" w:hAnsiTheme="minorEastAsia" w:cstheme="minorEastAsia"/>
-          <w:kern w:val="0"/>
-          <w:szCs w:val="21"/>
-        </w:rPr>
-        <w:t xml:space="preserve"> / SQLite</w:t>
-      </w:r>
-      <w:r>
-        <w:rPr>
-          <w:rFonts w:asciiTheme="minorEastAsia" w:eastAsiaTheme="minorEastAsia" w:hAnsiTheme="minorEastAsia" w:cstheme="minorEastAsia"/>
-          <w:kern w:val="0"/>
-          <w:szCs w:val="21"/>
-        </w:rPr>
-        <w:t xml:space="preserve">         </w:t>
-      </w:r>
-      <w:r>
-        <w:rPr>
-          <w:rFonts w:asciiTheme="minorEastAsia" w:eastAsiaTheme="minorEastAsia" w:hAnsiTheme="minorEastAsia" w:cstheme="minorEastAsia"/>
-          <w:kern w:val="0"/>
-          <w:szCs w:val="21"/>
-        </w:rPr>
-        <w:tab/>
-      </w:r>
-      <w:r>
-        <w:rPr>
-          <w:rFonts w:asciiTheme="minorEastAsia" w:eastAsiaTheme="minorEastAsia" w:hAnsiTheme="minorEastAsia" w:cstheme="minorEastAsia"/>
-          <w:kern w:val="0"/>
-          <w:szCs w:val="21"/>
-        </w:rPr>
-        <w:tab/>
-      </w:r>
-      <w:r>
-        <w:rPr>
-          <w:rFonts w:asciiTheme="minorEastAsia" w:eastAsiaTheme="minorEastAsia" w:hAnsiTheme="minorEastAsia" w:cstheme="minorEastAsia"/>
-          <w:kern w:val="0"/>
-          <w:szCs w:val="21"/>
-        </w:rPr>
-        <w:tab/>
-      </w:r>
-      <w:r>
-        <w:rPr>
-          <w:rFonts w:asciiTheme="minorEastAsia" w:eastAsiaTheme="minorEastAsia" w:hAnsiTheme="minorEastAsia" w:cstheme="minorEastAsia"/>
-          <w:kern w:val="0"/>
-          <w:szCs w:val="21"/>
-        </w:rPr>
-        <w:tab/>
-      </w:r>
-      <w:r>
-        <w:rPr>
-          <w:rFonts w:asciiTheme="minorEastAsia" w:eastAsiaTheme="minorEastAsia" w:hAnsiTheme="minorEastAsia" w:cstheme="minorEastAsia" w:hint="eastAsia"/>
-          <w:kern w:val="0"/>
-          <w:szCs w:val="21"/>
-        </w:rPr>
-        <w:t>开发语言：</w:t>
-      </w:r>
-      <w:r>
-        <w:rPr>
-          <w:rFonts w:asciiTheme="minorEastAsia" w:eastAsiaTheme="minorEastAsia" w:hAnsiTheme="minorEastAsia" w:cstheme="minorEastAsia" w:hint="eastAsia"/>
-          <w:kern w:val="0"/>
-          <w:szCs w:val="21"/>
-        </w:rPr>
-        <w:t>C/C++</w:t>
-      </w:r>
-      <w:r>
-        <w:rPr>
-          <w:rFonts w:asciiTheme="minorEastAsia" w:eastAsiaTheme="minorEastAsia" w:hAnsiTheme="minorEastAsia" w:cstheme="minorEastAsia" w:hint="eastAsia"/>
-          <w:kern w:val="0"/>
-          <w:szCs w:val="21"/>
-        </w:rPr>
-        <w:t xml:space="preserve"> </w:t>
-      </w:r>
+      <w:bookmarkStart w:id="2" w:name="OLE_LINK3"/>
+      <w:r>
+        <w:rPr>
+          <w:rFonts w:asciiTheme="minorEastAsia" w:eastAsiaTheme="minorEastAsia" w:hAnsiTheme="minorEastAsia" w:cstheme="minorEastAsia" w:hint="eastAsia"/>
+          <w:b/>
+          <w:bCs/>
+          <w:kern w:val="0"/>
+          <w:szCs w:val="21"/>
+        </w:rPr>
+        <w:t>项目描述：</w:t>
+      </w:r>
+      <w:r>
+        <w:rPr>
+          <w:rFonts w:asciiTheme="minorEastAsia" w:eastAsiaTheme="minorEastAsia" w:hAnsiTheme="minorEastAsia" w:cstheme="minorEastAsia" w:hint="eastAsia"/>
+          <w:kern w:val="0"/>
+          <w:szCs w:val="21"/>
+        </w:rPr>
+        <w:t>工商业储能系统要求实现精准的充放电策略控制，实时监控 BMS、PCS、电表、光伏、温控、消防等设备，并在异常时快速定位故障。目标平台为 ARM Linux 嵌入式设备，需满足 7×24 小时高可靠运行、本地 Web 管理、远程调度与固件升级需求。</w:t>
+      </w:r>
+    </w:p>
+    <w:p>
+      <w:pPr>
+        <w:numPr>
+          <w:ilvl w:val="0"/>
+          <w:numId w:val="8"/>
+        </w:numPr>
+        <w:spacing w:line="360" w:lineRule="exact"/>
+        <w:rPr>
+          <w:rFonts w:ascii="微软雅黑" w:eastAsia="微软雅黑" w:hAnsi="微软雅黑" w:cs="微软雅黑"/>
+          <w:b/>
+          <w:bCs/>
+        </w:rPr>
+      </w:pPr>
+      <w:bookmarkStart w:id="3" w:name="OLE_LINK4"/>
+      <w:r>
+        <w:rPr>
+          <w:rFonts w:ascii="微软雅黑" w:eastAsia="微软雅黑" w:hAnsi="微软雅黑" w:cs="微软雅黑" w:hint="eastAsia"/>
+          <w:b/>
+          <w:bCs/>
+        </w:rPr>
+        <w:t>工作内容与技术实现</w:t>
+      </w:r>
+      <w:bookmarkEnd w:id="3"/>
     </w:p>
     <w:p>
       <w:pPr>
@@ -1615,15 +1532,65 @@
           <w:kern w:val="0"/>
           <w:szCs w:val="21"/>
         </w:rPr>
-        <w:t>项目描述：</w:t>
-      </w:r>
-      <w:r>
-        <w:rPr>
-          <w:rFonts w:asciiTheme="minorEastAsia" w:eastAsiaTheme="minorEastAsia" w:hAnsiTheme="minorEastAsia" w:cstheme="minorEastAsia" w:hint="eastAsia"/>
-          <w:kern w:val="0"/>
-          <w:szCs w:val="21"/>
-        </w:rPr>
-        <w:t>工商业储能系统要求实现精准的充放电策略控制，实时监控 BMS、PCS、电表、光伏、温控、消防等设备，并在异常时快速定位故障。目标平台为 ARM Linux 嵌入式设备，需满足 7×24 小时高可靠运行、本地 Web 管理、远程调度与固件升级需求。</w:t>
+        <w:t>软件框架与配置管理：</w:t>
+      </w:r>
+      <w:r>
+        <w:rPr>
+          <w:rFonts w:asciiTheme="minorEastAsia" w:eastAsiaTheme="minorEastAsia" w:hAnsiTheme="minorEastAsia" w:cstheme="minorEastAsia" w:hint="eastAsia"/>
+          <w:kern w:val="0"/>
+          <w:szCs w:val="21"/>
+        </w:rPr>
+        <w:t>在Sampler/</w:t>
+      </w:r>
+      <w:proofErr w:type="spellStart"/>
+      <w:r>
+        <w:rPr>
+          <w:rFonts w:asciiTheme="minorEastAsia" w:eastAsiaTheme="minorEastAsia" w:hAnsiTheme="minorEastAsia" w:cstheme="minorEastAsia" w:hint="eastAsia"/>
+          <w:kern w:val="0"/>
+          <w:szCs w:val="21"/>
+        </w:rPr>
+        <w:t>DataProcessor</w:t>
+      </w:r>
+      <w:proofErr w:type="spellEnd"/>
+      <w:r>
+        <w:rPr>
+          <w:rFonts w:asciiTheme="minorEastAsia" w:eastAsiaTheme="minorEastAsia" w:hAnsiTheme="minorEastAsia" w:cstheme="minorEastAsia" w:hint="eastAsia"/>
+          <w:kern w:val="0"/>
+          <w:szCs w:val="21"/>
+        </w:rPr>
+        <w:t xml:space="preserve">/Reporter 分层动态库框架下开发和维护采集、数据处理及上报模块，参与通信接口封装与线程生命周期管理；基于SQLite </w:t>
+      </w:r>
+      <w:r>
+        <w:rPr>
+          <w:rFonts w:asciiTheme="minorEastAsia" w:eastAsiaTheme="minorEastAsia" w:hAnsiTheme="minorEastAsia" w:cstheme="minorEastAsia" w:hint="eastAsia"/>
+          <w:kern w:val="0"/>
+          <w:szCs w:val="21"/>
+        </w:rPr>
+        <w:t>构建配置/事件/告警/</w:t>
+      </w:r>
+      <w:r>
+        <w:rPr>
+          <w:rFonts w:asciiTheme="minorEastAsia" w:eastAsiaTheme="minorEastAsia" w:hAnsiTheme="minorEastAsia" w:cstheme="minorEastAsia" w:hint="eastAsia"/>
+          <w:kern w:val="0"/>
+          <w:szCs w:val="21"/>
+        </w:rPr>
+        <w:t>规则</w:t>
+      </w:r>
+      <w:r>
+        <w:rPr>
+          <w:rFonts w:asciiTheme="minorEastAsia" w:eastAsiaTheme="minorEastAsia" w:hAnsiTheme="minorEastAsia" w:cstheme="minorEastAsia" w:hint="eastAsia"/>
+          <w:kern w:val="0"/>
+          <w:szCs w:val="21"/>
+        </w:rPr>
+        <w:t>（DPR数据中心）</w:t>
+      </w:r>
+      <w:r>
+        <w:rPr>
+          <w:rFonts w:asciiTheme="minorEastAsia" w:eastAsiaTheme="minorEastAsia" w:hAnsiTheme="minorEastAsia" w:cstheme="minorEastAsia" w:hint="eastAsia"/>
+          <w:kern w:val="0"/>
+          <w:szCs w:val="21"/>
+        </w:rPr>
+        <w:t>及显示配置，通过统一事件队列处理状态变化和告警产生、恢复，供各上层接口使用。</w:t>
       </w:r>
     </w:p>
     <w:p>
@@ -1632,28 +1599,28 @@
         <w:wordWrap w:val="0"/>
         <w:spacing w:line="360" w:lineRule="exact"/>
         <w:rPr>
-          <w:rFonts w:asciiTheme="minorEastAsia" w:eastAsiaTheme="minorEastAsia" w:hAnsiTheme="minorEastAsia" w:cstheme="minorEastAsia" w:hint="eastAsia"/>
-          <w:kern w:val="0"/>
-          <w:szCs w:val="21"/>
-        </w:rPr>
-      </w:pPr>
-      <w:r>
-        <w:rPr>
-          <w:rFonts w:asciiTheme="minorEastAsia" w:eastAsiaTheme="minorEastAsia" w:hAnsiTheme="minorEastAsia" w:cstheme="minorEastAsia" w:hint="eastAsia"/>
-          <w:b/>
-          <w:bCs/>
-          <w:kern w:val="0"/>
-          <w:szCs w:val="21"/>
-        </w:rPr>
-        <w:t>软件框架与配置管理：</w:t>
-      </w:r>
-      <w:r>
-        <w:rPr>
-          <w:rFonts w:asciiTheme="minorEastAsia" w:eastAsiaTheme="minorEastAsia" w:hAnsiTheme="minorEastAsia" w:cstheme="minorEastAsia" w:hint="eastAsia"/>
-          <w:kern w:val="0"/>
-          <w:szCs w:val="21"/>
-        </w:rPr>
-        <w:t>在Sampler/</w:t>
+          <w:rFonts w:asciiTheme="minorEastAsia" w:eastAsiaTheme="minorEastAsia" w:hAnsiTheme="minorEastAsia" w:cstheme="minorEastAsia"/>
+          <w:kern w:val="0"/>
+          <w:szCs w:val="21"/>
+        </w:rPr>
+      </w:pPr>
+      <w:r>
+        <w:rPr>
+          <w:rFonts w:asciiTheme="minorEastAsia" w:eastAsiaTheme="minorEastAsia" w:hAnsiTheme="minorEastAsia" w:cstheme="minorEastAsia" w:hint="eastAsia"/>
+          <w:b/>
+          <w:bCs/>
+          <w:kern w:val="0"/>
+          <w:szCs w:val="21"/>
+        </w:rPr>
+        <w:t>设备接入与通信容错：</w:t>
+      </w:r>
+      <w:r>
+        <w:rPr>
+          <w:rFonts w:asciiTheme="minorEastAsia" w:eastAsiaTheme="minorEastAsia" w:hAnsiTheme="minorEastAsia" w:cstheme="minorEastAsia" w:hint="eastAsia"/>
+          <w:kern w:val="0"/>
+          <w:szCs w:val="21"/>
+        </w:rPr>
+        <w:t>基于</w:t>
       </w:r>
       <w:proofErr w:type="spellStart"/>
       <w:r>
@@ -1662,7 +1629,7 @@
           <w:kern w:val="0"/>
           <w:szCs w:val="21"/>
         </w:rPr>
-        <w:t>DataProcessor</w:t>
+        <w:t>SocketCAN</w:t>
       </w:r>
       <w:proofErr w:type="spellEnd"/>
       <w:r>
@@ -1671,7 +1638,25 @@
           <w:kern w:val="0"/>
           <w:szCs w:val="21"/>
         </w:rPr>
-        <w:t>/Reporter 分层动态库框架下开发和维护采集、数据处理及上报模块，参与通信接口封装与线程生命周期管理；基于 SQLite 管理设备模型、参数、告警规则及显示配置，通过统一事件队列处理状态变化和告警产生、恢复，供各上层接口使用。</w:t>
+        <w:t xml:space="preserve">、Modbus RTU/TCP 接入电池管理单元、PCS、光伏、电表及液冷设备，实现运行数据解析、心跳监测、参数批量设置与回读、历史故障读取；支持最多 4 组电池、28 </w:t>
+      </w:r>
+      <w:proofErr w:type="gramStart"/>
+      <w:r>
+        <w:rPr>
+          <w:rFonts w:asciiTheme="minorEastAsia" w:eastAsiaTheme="minorEastAsia" w:hAnsiTheme="minorEastAsia" w:cstheme="minorEastAsia" w:hint="eastAsia"/>
+          <w:kern w:val="0"/>
+          <w:szCs w:val="21"/>
+        </w:rPr>
+        <w:t>个</w:t>
+      </w:r>
+      <w:proofErr w:type="gramEnd"/>
+      <w:r>
+        <w:rPr>
+          <w:rFonts w:asciiTheme="minorEastAsia" w:eastAsiaTheme="minorEastAsia" w:hAnsiTheme="minorEastAsia" w:cstheme="minorEastAsia" w:hint="eastAsia"/>
+          <w:kern w:val="0"/>
+          <w:szCs w:val="21"/>
+        </w:rPr>
+        <w:t xml:space="preserve"> CAN 地址节点，处理通信超时、设备状态误判及控制指令冲突等问题。</w:t>
       </w:r>
     </w:p>
     <w:p>
@@ -1693,33 +1678,16 @@
           <w:kern w:val="0"/>
           <w:szCs w:val="21"/>
         </w:rPr>
-        <w:t>设备接入与通信容错：</w:t>
-      </w:r>
-      <w:r>
-        <w:rPr>
-          <w:rFonts w:asciiTheme="minorEastAsia" w:eastAsiaTheme="minorEastAsia" w:hAnsiTheme="minorEastAsia" w:cstheme="minorEastAsia" w:hint="eastAsia"/>
-          <w:kern w:val="0"/>
-          <w:szCs w:val="21"/>
-        </w:rPr>
-        <w:t>基于</w:t>
-      </w:r>
-      <w:proofErr w:type="spellStart"/>
-      <w:r>
-        <w:rPr>
-          <w:rFonts w:asciiTheme="minorEastAsia" w:eastAsiaTheme="minorEastAsia" w:hAnsiTheme="minorEastAsia" w:cstheme="minorEastAsia" w:hint="eastAsia"/>
-          <w:kern w:val="0"/>
-          <w:szCs w:val="21"/>
-        </w:rPr>
-        <w:t>SocketCAN</w:t>
-      </w:r>
-      <w:proofErr w:type="spellEnd"/>
-      <w:r>
-        <w:rPr>
-          <w:rFonts w:asciiTheme="minorEastAsia" w:eastAsiaTheme="minorEastAsia" w:hAnsiTheme="minorEastAsia" w:cstheme="minorEastAsia" w:hint="eastAsia"/>
-          <w:kern w:val="0"/>
-          <w:szCs w:val="21"/>
-        </w:rPr>
-        <w:t xml:space="preserve">、Modbus RTU/TCP 接入电池管理单元、PCS、光伏、电表及液冷设备，实现运行数据解析、心跳监测、参数批量设置与回读、历史故障读取；支持最多 4 组电池、28 </w:t>
+        <w:lastRenderedPageBreak/>
+        <w:t>能量控制与多机功率分配：</w:t>
+      </w:r>
+      <w:r>
+        <w:rPr>
+          <w:rFonts w:asciiTheme="minorEastAsia" w:eastAsiaTheme="minorEastAsia" w:hAnsiTheme="minorEastAsia" w:cstheme="minorEastAsia" w:hint="eastAsia"/>
+          <w:kern w:val="0"/>
+          <w:szCs w:val="21"/>
+        </w:rPr>
+        <w:t>实现基于PCC有功功率的防逆流闭环，结合三相总功率、单相最小功率、</w:t>
       </w:r>
       <w:proofErr w:type="gramStart"/>
       <w:r>
@@ -1728,7 +1696,7 @@
           <w:kern w:val="0"/>
           <w:szCs w:val="21"/>
         </w:rPr>
-        <w:t>个</w:t>
+        <w:t>预保护</w:t>
       </w:r>
       <w:proofErr w:type="gramEnd"/>
       <w:r>
@@ -1737,7 +1705,25 @@
           <w:kern w:val="0"/>
           <w:szCs w:val="21"/>
         </w:rPr>
-        <w:t xml:space="preserve"> CAN 地址节点，处理通信超时、设备状态误判及控制指令冲突等问题。</w:t>
+        <w:t>偏置及迟滞时间</w:t>
+      </w:r>
+      <w:proofErr w:type="gramStart"/>
+      <w:r>
+        <w:rPr>
+          <w:rFonts w:asciiTheme="minorEastAsia" w:eastAsiaTheme="minorEastAsia" w:hAnsiTheme="minorEastAsia" w:cstheme="minorEastAsia" w:hint="eastAsia"/>
+          <w:kern w:val="0"/>
+          <w:szCs w:val="21"/>
+        </w:rPr>
+        <w:t>窗处理</w:t>
+      </w:r>
+      <w:proofErr w:type="gramEnd"/>
+      <w:r>
+        <w:rPr>
+          <w:rFonts w:asciiTheme="minorEastAsia" w:eastAsiaTheme="minorEastAsia" w:hAnsiTheme="minorEastAsia" w:cstheme="minorEastAsia" w:hint="eastAsia"/>
+          <w:kern w:val="0"/>
+          <w:szCs w:val="21"/>
+        </w:rPr>
+        <w:t>调节延迟和功率振荡；实现防过载及策略模式互斥切换、多 PCS 节点功率分配、功率爬坡，以及基于时段计划和 SOC 门限的充放电调度。</w:t>
       </w:r>
     </w:p>
     <w:p>
@@ -1746,65 +1732,64 @@
         <w:wordWrap w:val="0"/>
         <w:spacing w:line="360" w:lineRule="exact"/>
         <w:rPr>
-          <w:rFonts w:asciiTheme="minorEastAsia" w:eastAsiaTheme="minorEastAsia" w:hAnsiTheme="minorEastAsia" w:cstheme="minorEastAsia" w:hint="eastAsia"/>
-          <w:kern w:val="0"/>
-          <w:szCs w:val="21"/>
-        </w:rPr>
-      </w:pPr>
-      <w:r>
-        <w:rPr>
-          <w:rFonts w:asciiTheme="minorEastAsia" w:eastAsiaTheme="minorEastAsia" w:hAnsiTheme="minorEastAsia" w:cstheme="minorEastAsia" w:hint="eastAsia"/>
-          <w:b/>
-          <w:bCs/>
-          <w:kern w:val="0"/>
-          <w:szCs w:val="21"/>
-        </w:rPr>
-        <w:lastRenderedPageBreak/>
-        <w:t>能量控制与多机功率分配：</w:t>
-      </w:r>
-      <w:r>
-        <w:rPr>
-          <w:rFonts w:asciiTheme="minorEastAsia" w:eastAsiaTheme="minorEastAsia" w:hAnsiTheme="minorEastAsia" w:cstheme="minorEastAsia" w:hint="eastAsia"/>
-          <w:kern w:val="0"/>
-          <w:szCs w:val="21"/>
-        </w:rPr>
-        <w:t>实现基于PCC有功功率的防逆流闭环，结合三相总功率、单相最小功率、</w:t>
-      </w:r>
-      <w:proofErr w:type="gramStart"/>
-      <w:r>
-        <w:rPr>
-          <w:rFonts w:asciiTheme="minorEastAsia" w:eastAsiaTheme="minorEastAsia" w:hAnsiTheme="minorEastAsia" w:cstheme="minorEastAsia" w:hint="eastAsia"/>
-          <w:kern w:val="0"/>
-          <w:szCs w:val="21"/>
-        </w:rPr>
-        <w:t>预保护</w:t>
-      </w:r>
-      <w:proofErr w:type="gramEnd"/>
-      <w:r>
-        <w:rPr>
-          <w:rFonts w:asciiTheme="minorEastAsia" w:eastAsiaTheme="minorEastAsia" w:hAnsiTheme="minorEastAsia" w:cstheme="minorEastAsia" w:hint="eastAsia"/>
-          <w:kern w:val="0"/>
-          <w:szCs w:val="21"/>
-        </w:rPr>
-        <w:t>偏置及迟滞时间</w:t>
-      </w:r>
-      <w:proofErr w:type="gramStart"/>
-      <w:r>
-        <w:rPr>
-          <w:rFonts w:asciiTheme="minorEastAsia" w:eastAsiaTheme="minorEastAsia" w:hAnsiTheme="minorEastAsia" w:cstheme="minorEastAsia" w:hint="eastAsia"/>
-          <w:kern w:val="0"/>
-          <w:szCs w:val="21"/>
-        </w:rPr>
-        <w:t>窗处理</w:t>
-      </w:r>
-      <w:proofErr w:type="gramEnd"/>
-      <w:r>
-        <w:rPr>
-          <w:rFonts w:asciiTheme="minorEastAsia" w:eastAsiaTheme="minorEastAsia" w:hAnsiTheme="minorEastAsia" w:cstheme="minorEastAsia" w:hint="eastAsia"/>
-          <w:kern w:val="0"/>
-          <w:szCs w:val="21"/>
-        </w:rPr>
-        <w:t>调节延迟和功率振荡；实现防过载及策略模式互斥切换、多 PCS 节点功率分配、功率爬坡，以及基于时段计划和 SOC 门限的充放电调度。</w:t>
+          <w:rFonts w:asciiTheme="minorEastAsia" w:eastAsiaTheme="minorEastAsia" w:hAnsiTheme="minorEastAsia" w:cstheme="minorEastAsia"/>
+          <w:kern w:val="0"/>
+          <w:szCs w:val="21"/>
+        </w:rPr>
+      </w:pPr>
+      <w:r>
+        <w:rPr>
+          <w:rFonts w:asciiTheme="minorEastAsia" w:eastAsiaTheme="minorEastAsia" w:hAnsiTheme="minorEastAsia" w:cstheme="minorEastAsia" w:hint="eastAsia"/>
+          <w:b/>
+          <w:bCs/>
+          <w:kern w:val="0"/>
+          <w:szCs w:val="21"/>
+        </w:rPr>
+        <w:t>云平台与调度接口：</w:t>
+      </w:r>
+      <w:r>
+        <w:rPr>
+          <w:rFonts w:asciiTheme="minorEastAsia" w:eastAsiaTheme="minorEastAsia" w:hAnsiTheme="minorEastAsia" w:cstheme="minorEastAsia" w:hint="eastAsia"/>
+          <w:kern w:val="0"/>
+          <w:szCs w:val="21"/>
+        </w:rPr>
+        <w:t xml:space="preserve">基于 </w:t>
+      </w:r>
+      <w:proofErr w:type="spellStart"/>
+      <w:r>
+        <w:rPr>
+          <w:rFonts w:asciiTheme="minorEastAsia" w:eastAsiaTheme="minorEastAsia" w:hAnsiTheme="minorEastAsia" w:cstheme="minorEastAsia" w:hint="eastAsia"/>
+          <w:kern w:val="0"/>
+          <w:szCs w:val="21"/>
+        </w:rPr>
+        <w:t>Paho</w:t>
+      </w:r>
+      <w:proofErr w:type="spellEnd"/>
+      <w:r>
+        <w:rPr>
+          <w:rFonts w:asciiTheme="minorEastAsia" w:eastAsiaTheme="minorEastAsia" w:hAnsiTheme="minorEastAsia" w:cstheme="minorEastAsia" w:hint="eastAsia"/>
+          <w:kern w:val="0"/>
+          <w:szCs w:val="21"/>
+        </w:rPr>
+        <w:t xml:space="preserve"> MQTT C、</w:t>
+      </w:r>
+      <w:proofErr w:type="spellStart"/>
+      <w:r>
+        <w:rPr>
+          <w:rFonts w:asciiTheme="minorEastAsia" w:eastAsiaTheme="minorEastAsia" w:hAnsiTheme="minorEastAsia" w:cstheme="minorEastAsia" w:hint="eastAsia"/>
+          <w:kern w:val="0"/>
+          <w:szCs w:val="21"/>
+        </w:rPr>
+        <w:t>cJSON</w:t>
+      </w:r>
+      <w:proofErr w:type="spellEnd"/>
+      <w:r>
+        <w:rPr>
+          <w:rFonts w:asciiTheme="minorEastAsia" w:eastAsiaTheme="minorEastAsia" w:hAnsiTheme="minorEastAsia" w:cstheme="minorEastAsia" w:hint="eastAsia"/>
+          <w:kern w:val="0"/>
+          <w:szCs w:val="21"/>
+        </w:rPr>
+        <w:t>、OpenSSL 完成多套私有协议适配，处理 Topic、报文字段、签名鉴权及 TLS 证书差异，支持周期数据和事件告警上报；维护 IEC 104 遥信、遥测、遥控、遥调映射，扩展功率、SOC 和保护参数点位，支持5路客户端并发连接。</w:t>
       </w:r>
     </w:p>
     <w:p>
@@ -1813,28 +1798,28 @@
         <w:wordWrap w:val="0"/>
         <w:spacing w:line="360" w:lineRule="exact"/>
         <w:rPr>
-          <w:rFonts w:asciiTheme="minorEastAsia" w:eastAsiaTheme="minorEastAsia" w:hAnsiTheme="minorEastAsia" w:cstheme="minorEastAsia" w:hint="eastAsia"/>
-          <w:kern w:val="0"/>
-          <w:szCs w:val="21"/>
-        </w:rPr>
-      </w:pPr>
-      <w:r>
-        <w:rPr>
-          <w:rFonts w:asciiTheme="minorEastAsia" w:eastAsiaTheme="minorEastAsia" w:hAnsiTheme="minorEastAsia" w:cstheme="minorEastAsia" w:hint="eastAsia"/>
-          <w:b/>
-          <w:bCs/>
-          <w:kern w:val="0"/>
-          <w:szCs w:val="21"/>
-        </w:rPr>
-        <w:t>云平台与调度接口：</w:t>
-      </w:r>
-      <w:r>
-        <w:rPr>
-          <w:rFonts w:asciiTheme="minorEastAsia" w:eastAsiaTheme="minorEastAsia" w:hAnsiTheme="minorEastAsia" w:cstheme="minorEastAsia" w:hint="eastAsia"/>
-          <w:kern w:val="0"/>
-          <w:szCs w:val="21"/>
-        </w:rPr>
-        <w:t xml:space="preserve">基于 </w:t>
+          <w:rFonts w:asciiTheme="minorEastAsia" w:eastAsiaTheme="minorEastAsia" w:hAnsiTheme="minorEastAsia" w:cstheme="minorEastAsia"/>
+          <w:kern w:val="0"/>
+          <w:szCs w:val="21"/>
+        </w:rPr>
+      </w:pPr>
+      <w:r>
+        <w:rPr>
+          <w:rFonts w:asciiTheme="minorEastAsia" w:eastAsiaTheme="minorEastAsia" w:hAnsiTheme="minorEastAsia" w:cstheme="minorEastAsia" w:hint="eastAsia"/>
+          <w:b/>
+          <w:bCs/>
+          <w:kern w:val="0"/>
+          <w:szCs w:val="21"/>
+        </w:rPr>
+        <w:t>Web 管理与远程升级：</w:t>
+      </w:r>
+      <w:r>
+        <w:rPr>
+          <w:rFonts w:asciiTheme="minorEastAsia" w:eastAsiaTheme="minorEastAsia" w:hAnsiTheme="minorEastAsia" w:cstheme="minorEastAsia" w:hint="eastAsia"/>
+          <w:kern w:val="0"/>
+          <w:szCs w:val="21"/>
+        </w:rPr>
+        <w:t>基于</w:t>
       </w:r>
       <w:proofErr w:type="spellStart"/>
       <w:r>
@@ -1843,7 +1828,7 @@
           <w:kern w:val="0"/>
           <w:szCs w:val="21"/>
         </w:rPr>
-        <w:t>Paho</w:t>
+        <w:t>FastCGI</w:t>
       </w:r>
       <w:proofErr w:type="spellEnd"/>
       <w:r>
@@ -1852,7 +1837,7 @@
           <w:kern w:val="0"/>
           <w:szCs w:val="21"/>
         </w:rPr>
-        <w:t xml:space="preserve"> MQTT C、</w:t>
+        <w:t xml:space="preserve"> + </w:t>
       </w:r>
       <w:proofErr w:type="spellStart"/>
       <w:r>
@@ -1861,6 +1846,24 @@
           <w:kern w:val="0"/>
           <w:szCs w:val="21"/>
         </w:rPr>
+        <w:t>nanomsg</w:t>
+      </w:r>
+      <w:proofErr w:type="spellEnd"/>
+      <w:r>
+        <w:rPr>
+          <w:rFonts w:asciiTheme="minorEastAsia" w:eastAsiaTheme="minorEastAsia" w:hAnsiTheme="minorEastAsia" w:cstheme="minorEastAsia" w:hint="eastAsia"/>
+          <w:kern w:val="0"/>
+          <w:szCs w:val="21"/>
+        </w:rPr>
+        <w:t xml:space="preserve"> + </w:t>
+      </w:r>
+      <w:proofErr w:type="spellStart"/>
+      <w:r>
+        <w:rPr>
+          <w:rFonts w:asciiTheme="minorEastAsia" w:eastAsiaTheme="minorEastAsia" w:hAnsiTheme="minorEastAsia" w:cstheme="minorEastAsia" w:hint="eastAsia"/>
+          <w:kern w:val="0"/>
+          <w:szCs w:val="21"/>
+        </w:rPr>
         <w:t>cJSON</w:t>
       </w:r>
       <w:proofErr w:type="spellEnd"/>
@@ -1870,7 +1873,25 @@
           <w:kern w:val="0"/>
           <w:szCs w:val="21"/>
         </w:rPr>
-        <w:t>、OpenSSL 完成多套私有协议适配，处理 Topic、报文字段、签名鉴权及 TLS 证书差异，支持周期数据和事件告警上报；维护 IEC 104 遥信、遥测、遥控、遥调映射，扩展功率、SOC 和保护参数点位，支持5路客户端并发连接。</w:t>
+        <w:t xml:space="preserve"> 实现 HTTP 请求解析及业务进程通信，提供状态监控、参数设置、系统控制、日志与告警查询、升级等接口；开发基于 UDS 的 BMS 固件升级功能，实现分包传输、</w:t>
+      </w:r>
+      <w:proofErr w:type="gramStart"/>
+      <w:r>
+        <w:rPr>
+          <w:rFonts w:asciiTheme="minorEastAsia" w:eastAsiaTheme="minorEastAsia" w:hAnsiTheme="minorEastAsia" w:cstheme="minorEastAsia" w:hint="eastAsia"/>
+          <w:kern w:val="0"/>
+          <w:szCs w:val="21"/>
+        </w:rPr>
+        <w:t>末帧丢包</w:t>
+      </w:r>
+      <w:proofErr w:type="gramEnd"/>
+      <w:r>
+        <w:rPr>
+          <w:rFonts w:asciiTheme="minorEastAsia" w:eastAsiaTheme="minorEastAsia" w:hAnsiTheme="minorEastAsia" w:cstheme="minorEastAsia" w:hint="eastAsia"/>
+          <w:kern w:val="0"/>
+          <w:szCs w:val="21"/>
+        </w:rPr>
+        <w:t>重发、干扰数据过滤及进度、状态上报，维护远程数据下载与运维接入功能。</w:t>
       </w:r>
     </w:p>
     <w:p>
@@ -1879,82 +1900,28 @@
         <w:wordWrap w:val="0"/>
         <w:spacing w:line="360" w:lineRule="exact"/>
         <w:rPr>
-          <w:rFonts w:asciiTheme="minorEastAsia" w:eastAsiaTheme="minorEastAsia" w:hAnsiTheme="minorEastAsia" w:cstheme="minorEastAsia" w:hint="eastAsia"/>
-          <w:kern w:val="0"/>
-          <w:szCs w:val="21"/>
-        </w:rPr>
-      </w:pPr>
-      <w:r>
-        <w:rPr>
-          <w:rFonts w:asciiTheme="minorEastAsia" w:eastAsiaTheme="minorEastAsia" w:hAnsiTheme="minorEastAsia" w:cstheme="minorEastAsia" w:hint="eastAsia"/>
-          <w:b/>
-          <w:bCs/>
-          <w:kern w:val="0"/>
-          <w:szCs w:val="21"/>
-        </w:rPr>
-        <w:t>Web 管理与远程升级：</w:t>
-      </w:r>
-      <w:r>
-        <w:rPr>
-          <w:rFonts w:asciiTheme="minorEastAsia" w:eastAsiaTheme="minorEastAsia" w:hAnsiTheme="minorEastAsia" w:cstheme="minorEastAsia" w:hint="eastAsia"/>
-          <w:kern w:val="0"/>
-          <w:szCs w:val="21"/>
-        </w:rPr>
-        <w:t>基于</w:t>
-      </w:r>
-      <w:proofErr w:type="spellStart"/>
-      <w:r>
-        <w:rPr>
-          <w:rFonts w:asciiTheme="minorEastAsia" w:eastAsiaTheme="minorEastAsia" w:hAnsiTheme="minorEastAsia" w:cstheme="minorEastAsia" w:hint="eastAsia"/>
-          <w:kern w:val="0"/>
-          <w:szCs w:val="21"/>
-        </w:rPr>
-        <w:t>FastCGI</w:t>
-      </w:r>
-      <w:proofErr w:type="spellEnd"/>
-      <w:r>
-        <w:rPr>
-          <w:rFonts w:asciiTheme="minorEastAsia" w:eastAsiaTheme="minorEastAsia" w:hAnsiTheme="minorEastAsia" w:cstheme="minorEastAsia" w:hint="eastAsia"/>
-          <w:kern w:val="0"/>
-          <w:szCs w:val="21"/>
-        </w:rPr>
-        <w:t xml:space="preserve"> + </w:t>
-      </w:r>
-      <w:proofErr w:type="spellStart"/>
-      <w:r>
-        <w:rPr>
-          <w:rFonts w:asciiTheme="minorEastAsia" w:eastAsiaTheme="minorEastAsia" w:hAnsiTheme="minorEastAsia" w:cstheme="minorEastAsia" w:hint="eastAsia"/>
-          <w:kern w:val="0"/>
-          <w:szCs w:val="21"/>
-        </w:rPr>
-        <w:t>nanomsg</w:t>
-      </w:r>
-      <w:proofErr w:type="spellEnd"/>
-      <w:r>
-        <w:rPr>
-          <w:rFonts w:asciiTheme="minorEastAsia" w:eastAsiaTheme="minorEastAsia" w:hAnsiTheme="minorEastAsia" w:cstheme="minorEastAsia" w:hint="eastAsia"/>
-          <w:kern w:val="0"/>
-          <w:szCs w:val="21"/>
-        </w:rPr>
-        <w:t xml:space="preserve"> + </w:t>
-      </w:r>
-      <w:proofErr w:type="spellStart"/>
-      <w:r>
-        <w:rPr>
-          <w:rFonts w:asciiTheme="minorEastAsia" w:eastAsiaTheme="minorEastAsia" w:hAnsiTheme="minorEastAsia" w:cstheme="minorEastAsia" w:hint="eastAsia"/>
-          <w:kern w:val="0"/>
-          <w:szCs w:val="21"/>
-        </w:rPr>
-        <w:t>cJSON</w:t>
-      </w:r>
-      <w:proofErr w:type="spellEnd"/>
-      <w:r>
-        <w:rPr>
-          <w:rFonts w:asciiTheme="minorEastAsia" w:eastAsiaTheme="minorEastAsia" w:hAnsiTheme="minorEastAsia" w:cstheme="minorEastAsia" w:hint="eastAsia"/>
-          <w:kern w:val="0"/>
-          <w:szCs w:val="21"/>
-        </w:rPr>
-        <w:t xml:space="preserve"> 实现 HTTP 请求解析及业务进程通信，提供状态监控、参数设置、系统控制、日志与告警查询、升级等接口；开发基于 UDS 的 BMS 固件升级功能，实现分包传输、</w:t>
+          <w:rFonts w:asciiTheme="minorEastAsia" w:eastAsiaTheme="minorEastAsia" w:hAnsiTheme="minorEastAsia" w:cstheme="minorEastAsia"/>
+          <w:kern w:val="0"/>
+          <w:szCs w:val="21"/>
+        </w:rPr>
+      </w:pPr>
+      <w:r>
+        <w:rPr>
+          <w:rFonts w:asciiTheme="minorEastAsia" w:eastAsiaTheme="minorEastAsia" w:hAnsiTheme="minorEastAsia" w:cstheme="minorEastAsia" w:hint="eastAsia"/>
+          <w:b/>
+          <w:bCs/>
+          <w:kern w:val="0"/>
+          <w:szCs w:val="21"/>
+        </w:rPr>
+        <w:t>站级协同与异常处理：</w:t>
+      </w:r>
+      <w:r>
+        <w:rPr>
+          <w:rFonts w:asciiTheme="minorEastAsia" w:eastAsiaTheme="minorEastAsia" w:hAnsiTheme="minorEastAsia" w:cstheme="minorEastAsia" w:hint="eastAsia"/>
+          <w:kern w:val="0"/>
+          <w:szCs w:val="21"/>
+        </w:rPr>
+        <w:t>基于 TCP/UDP 自定义协议，</w:t>
       </w:r>
       <w:proofErr w:type="gramStart"/>
       <w:r>
@@ -1963,7 +1930,7 @@
           <w:kern w:val="0"/>
           <w:szCs w:val="21"/>
         </w:rPr>
-        <w:t>末帧丢包</w:t>
+        <w:t>实现站</w:t>
       </w:r>
       <w:proofErr w:type="gramEnd"/>
       <w:r>
@@ -1972,7 +1939,7 @@
           <w:kern w:val="0"/>
           <w:szCs w:val="21"/>
         </w:rPr>
-        <w:t>重发、干扰数据过滤及进度、状态上报，维护远程数据下载与运维接入功能。</w:t>
+        <w:t>级 EMS 对多台从机的配置同步、数据汇聚与功率调度；加入自动重连、周期配置校验及告警屏蔽机制，处理主从配置差异和通信中断等现场问题。</w:t>
       </w:r>
     </w:p>
     <w:p>
@@ -1991,67 +1958,34 @@
           <w:rFonts w:asciiTheme="minorEastAsia" w:eastAsiaTheme="minorEastAsia" w:hAnsiTheme="minorEastAsia" w:cstheme="minorEastAsia" w:hint="eastAsia"/>
           <w:b/>
           <w:bCs/>
-          <w:kern w:val="0"/>
-          <w:szCs w:val="21"/>
-        </w:rPr>
-        <w:t>站级协同与异常处理：</w:t>
-      </w:r>
-      <w:r>
-        <w:rPr>
-          <w:rFonts w:asciiTheme="minorEastAsia" w:eastAsiaTheme="minorEastAsia" w:hAnsiTheme="minorEastAsia" w:cstheme="minorEastAsia" w:hint="eastAsia"/>
-          <w:kern w:val="0"/>
-          <w:szCs w:val="21"/>
-        </w:rPr>
-        <w:t>基于 TCP/UDP 自定义协议，</w:t>
-      </w:r>
-      <w:proofErr w:type="gramStart"/>
-      <w:r>
-        <w:rPr>
-          <w:rFonts w:asciiTheme="minorEastAsia" w:eastAsiaTheme="minorEastAsia" w:hAnsiTheme="minorEastAsia" w:cstheme="minorEastAsia" w:hint="eastAsia"/>
-          <w:kern w:val="0"/>
-          <w:szCs w:val="21"/>
-        </w:rPr>
-        <w:t>实现站</w:t>
-      </w:r>
-      <w:proofErr w:type="gramEnd"/>
-      <w:r>
-        <w:rPr>
-          <w:rFonts w:asciiTheme="minorEastAsia" w:eastAsiaTheme="minorEastAsia" w:hAnsiTheme="minorEastAsia" w:cstheme="minorEastAsia" w:hint="eastAsia"/>
-          <w:kern w:val="0"/>
-          <w:szCs w:val="21"/>
-        </w:rPr>
-        <w:t>级 EMS 对多台从机的配置同步、数据汇聚与功率调度；加入自动重连、周期配置校验及告警屏蔽机制，处理主从配置差异和通信中断等现场问题。</w:t>
+          <w:szCs w:val="21"/>
+        </w:rPr>
+        <w:t>项目收获：</w:t>
+      </w:r>
+      <w:r>
+        <w:rPr>
+          <w:rFonts w:asciiTheme="minorEastAsia" w:eastAsiaTheme="minorEastAsia" w:hAnsiTheme="minorEastAsia" w:cstheme="minorEastAsia" w:hint="eastAsia"/>
+          <w:szCs w:val="21"/>
+        </w:rPr>
+        <w:t>该软件系统已成功稳定运作1000+台工商业储能设备，分布在国内各省市及欧洲地区、实现 2 秒内欧洲防逆流认证、以及 200 毫秒快速响应放电等要求。远程运维能力：支持对BMS、PCS、EMS 进行远程OTA升级</w:t>
+      </w:r>
+      <w:r>
+        <w:rPr>
+          <w:rFonts w:asciiTheme="minorEastAsia" w:eastAsiaTheme="minorEastAsia" w:hAnsiTheme="minorEastAsia" w:cstheme="minorEastAsia" w:hint="eastAsia"/>
+          <w:szCs w:val="21"/>
+        </w:rPr>
+        <w:t>。</w:t>
+      </w:r>
+      <w:r>
+        <w:rPr>
+          <w:rFonts w:asciiTheme="minorEastAsia" w:eastAsiaTheme="minorEastAsia" w:hAnsiTheme="minorEastAsia" w:cstheme="minorEastAsia"/>
+          <w:kern w:val="0"/>
+          <w:szCs w:val="21"/>
+        </w:rPr>
+        <w:t xml:space="preserve"> </w:t>
       </w:r>
     </w:p>
-    <w:p>
-      <w:pPr>
-        <w:widowControl/>
-        <w:wordWrap w:val="0"/>
-        <w:spacing w:line="360" w:lineRule="exact"/>
-        <w:rPr>
-          <w:rFonts w:asciiTheme="minorEastAsia" w:eastAsiaTheme="minorEastAsia" w:hAnsiTheme="minorEastAsia" w:cstheme="minorEastAsia"/>
-          <w:kern w:val="0"/>
-          <w:szCs w:val="21"/>
-        </w:rPr>
-      </w:pPr>
-      <w:r>
-        <w:rPr>
-          <w:rFonts w:asciiTheme="minorEastAsia" w:eastAsiaTheme="minorEastAsia" w:hAnsiTheme="minorEastAsia" w:cstheme="minorEastAsia" w:hint="eastAsia"/>
-          <w:b/>
-          <w:bCs/>
-          <w:szCs w:val="21"/>
-        </w:rPr>
-        <w:t>项目收获：</w:t>
-      </w:r>
-      <w:r>
-        <w:rPr>
-          <w:rFonts w:asciiTheme="minorEastAsia" w:eastAsiaTheme="minorEastAsia" w:hAnsiTheme="minorEastAsia" w:cstheme="minorEastAsia" w:hint="eastAsia"/>
-          <w:szCs w:val="21"/>
-        </w:rPr>
-        <w:t>该软件系统已成功稳定运作1000+ 台工商业储能设备，分布在国内各省市及欧洲地区、实现 2 秒内欧洲防逆流认证、以及 200 毫秒快速响应放电等要求。远程运维能力：支持对 BMS、PCS、EMS 进行远程 OTA 升级，支持远程下载运行数据，支持远程访问网页和系统。</w:t>
-      </w:r>
-    </w:p>
-    <w:bookmarkEnd w:id="1"/>
+    <w:bookmarkEnd w:id="2"/>
     <w:p>
       <w:pPr>
         <w:widowControl/>
@@ -2152,10 +2086,12 @@
       <w:r>
         <w:rPr>
           <w:rFonts w:ascii="微软雅黑" w:eastAsia="微软雅黑" w:hAnsi="微软雅黑" w:cs="微软雅黑" w:hint="eastAsia"/>
-          <w:kern w:val="0"/>
-          <w:szCs w:val="21"/>
-        </w:rPr>
-        <w:t xml:space="preserve">            </w:t>
+          <w:b/>
+          <w:bCs/>
+          <w:kern w:val="0"/>
+          <w:szCs w:val="21"/>
+        </w:rPr>
+        <w:t>深圳英飞源技术有限公司</w:t>
       </w:r>
       <w:r>
         <w:rPr>
@@ -2163,15 +2099,7 @@
           <w:kern w:val="0"/>
           <w:szCs w:val="21"/>
         </w:rPr>
-        <w:t xml:space="preserve"> </w:t>
-      </w:r>
-      <w:r>
-        <w:rPr>
-          <w:rFonts w:ascii="微软雅黑" w:eastAsia="微软雅黑" w:hAnsi="微软雅黑" w:cs="微软雅黑"/>
-          <w:kern w:val="0"/>
-          <w:szCs w:val="21"/>
-        </w:rPr>
-        <w:t xml:space="preserve">        </w:t>
+        <w:t xml:space="preserve">   </w:t>
       </w:r>
       <w:proofErr w:type="gramStart"/>
       <w:r>
@@ -2182,7 +2110,7 @@
           <w:kern w:val="0"/>
           <w:szCs w:val="21"/>
         </w:rPr>
-        <w:t>基于芯驰</w:t>
+        <w:t>芯驰</w:t>
       </w:r>
       <w:proofErr w:type="gramEnd"/>
       <w:r>
@@ -2210,10 +2138,38 @@
       <w:r>
         <w:rPr>
           <w:rFonts w:asciiTheme="minorEastAsia" w:eastAsiaTheme="minorEastAsia" w:hAnsiTheme="minorEastAsia" w:cstheme="minorEastAsia" w:hint="eastAsia"/>
-          <w:kern w:val="0"/>
-          <w:szCs w:val="21"/>
-        </w:rPr>
-        <w:t>开发环境：</w:t>
+          <w:b/>
+          <w:bCs/>
+          <w:kern w:val="0"/>
+          <w:szCs w:val="21"/>
+        </w:rPr>
+        <w:t>项目描述：</w:t>
+      </w:r>
+      <w:r>
+        <w:rPr>
+          <w:rFonts w:asciiTheme="minorEastAsia" w:eastAsiaTheme="minorEastAsia" w:hAnsiTheme="minorEastAsia" w:cstheme="minorEastAsia" w:hint="eastAsia"/>
+          <w:kern w:val="0"/>
+          <w:szCs w:val="21"/>
+        </w:rPr>
+        <w:t>负责将原有储能 EMS 核心软件</w:t>
+      </w:r>
+      <w:proofErr w:type="gramStart"/>
+      <w:r>
+        <w:rPr>
+          <w:rFonts w:asciiTheme="minorEastAsia" w:eastAsiaTheme="minorEastAsia" w:hAnsiTheme="minorEastAsia" w:cstheme="minorEastAsia" w:hint="eastAsia"/>
+          <w:kern w:val="0"/>
+          <w:szCs w:val="21"/>
+        </w:rPr>
+        <w:t>栈</w:t>
+      </w:r>
+      <w:proofErr w:type="gramEnd"/>
+      <w:r>
+        <w:rPr>
+          <w:rFonts w:asciiTheme="minorEastAsia" w:eastAsiaTheme="minorEastAsia" w:hAnsiTheme="minorEastAsia" w:cstheme="minorEastAsia" w:hint="eastAsia"/>
+          <w:kern w:val="0"/>
+          <w:szCs w:val="21"/>
+        </w:rPr>
+        <w:t xml:space="preserve">平滑移植到 </w:t>
       </w:r>
       <w:proofErr w:type="spellStart"/>
       <w:r>
@@ -2231,71 +2187,47 @@
           <w:kern w:val="0"/>
           <w:szCs w:val="21"/>
         </w:rPr>
-        <w:t xml:space="preserve"> D9（A55 + R5 异构多核，Linux + RTOS）</w:t>
-      </w:r>
-      <w:r>
-        <w:rPr>
-          <w:rFonts w:asciiTheme="minorEastAsia" w:eastAsiaTheme="minorEastAsia" w:hAnsiTheme="minorEastAsia" w:cstheme="minorEastAsia"/>
-          <w:kern w:val="0"/>
-          <w:szCs w:val="21"/>
-        </w:rPr>
-        <w:tab/>
-      </w:r>
-      <w:r>
-        <w:rPr>
-          <w:rFonts w:asciiTheme="minorEastAsia" w:eastAsiaTheme="minorEastAsia" w:hAnsiTheme="minorEastAsia" w:cstheme="minorEastAsia"/>
-          <w:kern w:val="0"/>
-          <w:szCs w:val="21"/>
-        </w:rPr>
-        <w:tab/>
-      </w:r>
-      <w:r>
-        <w:rPr>
-          <w:rFonts w:asciiTheme="minorEastAsia" w:eastAsiaTheme="minorEastAsia" w:hAnsiTheme="minorEastAsia" w:cstheme="minorEastAsia"/>
-          <w:kern w:val="0"/>
-          <w:szCs w:val="21"/>
-        </w:rPr>
-        <w:tab/>
-      </w:r>
-      <w:r>
-        <w:rPr>
-          <w:rFonts w:asciiTheme="minorEastAsia" w:eastAsiaTheme="minorEastAsia" w:hAnsiTheme="minorEastAsia" w:cstheme="minorEastAsia"/>
-          <w:kern w:val="0"/>
-          <w:szCs w:val="21"/>
-        </w:rPr>
-        <w:tab/>
-      </w:r>
-      <w:r>
-        <w:rPr>
-          <w:rFonts w:asciiTheme="minorEastAsia" w:eastAsiaTheme="minorEastAsia" w:hAnsiTheme="minorEastAsia" w:cstheme="minorEastAsia"/>
-          <w:kern w:val="0"/>
-          <w:szCs w:val="21"/>
-        </w:rPr>
-        <w:tab/>
-      </w:r>
-      <w:r>
-        <w:rPr>
-          <w:rFonts w:asciiTheme="minorEastAsia" w:eastAsiaTheme="minorEastAsia" w:hAnsiTheme="minorEastAsia" w:cstheme="minorEastAsia"/>
-          <w:kern w:val="0"/>
-          <w:szCs w:val="21"/>
-        </w:rPr>
-        <w:tab/>
-      </w:r>
-      <w:r>
-        <w:rPr>
-          <w:rFonts w:asciiTheme="minorEastAsia" w:eastAsiaTheme="minorEastAsia" w:hAnsiTheme="minorEastAsia" w:cstheme="minorEastAsia" w:hint="eastAsia"/>
-          <w:kern w:val="0"/>
-          <w:szCs w:val="21"/>
-        </w:rPr>
-        <w:t>开发语言：</w:t>
-      </w:r>
-      <w:r>
-        <w:rPr>
-          <w:rFonts w:asciiTheme="minorEastAsia" w:eastAsiaTheme="minorEastAsia" w:hAnsiTheme="minorEastAsia" w:cstheme="minorEastAsia" w:hint="eastAsia"/>
-          <w:kern w:val="0"/>
-          <w:szCs w:val="21"/>
-        </w:rPr>
-        <w:t>C/C++</w:t>
+        <w:t xml:space="preserve"> D9 新平台，并主导全新储能变流器（PCS，235kW）通信协议与自动管理策略的开发调试。项目采用"采样器 Sampler → 数据中心 DPR → 上报器 Reporter"三层</w:t>
+      </w:r>
+      <w:proofErr w:type="gramStart"/>
+      <w:r>
+        <w:rPr>
+          <w:rFonts w:asciiTheme="minorEastAsia" w:eastAsiaTheme="minorEastAsia" w:hAnsiTheme="minorEastAsia" w:cstheme="minorEastAsia" w:hint="eastAsia"/>
+          <w:kern w:val="0"/>
+          <w:szCs w:val="21"/>
+        </w:rPr>
+        <w:t>插件化</w:t>
+      </w:r>
+      <w:proofErr w:type="gramEnd"/>
+      <w:r>
+        <w:rPr>
+          <w:rFonts w:asciiTheme="minorEastAsia" w:eastAsiaTheme="minorEastAsia" w:hAnsiTheme="minorEastAsia" w:cstheme="minorEastAsia" w:hint="eastAsia"/>
+          <w:kern w:val="0"/>
+          <w:szCs w:val="21"/>
+        </w:rPr>
+        <w:t>架构，覆盖 BMS 数据采集、EMS 能量管理、PCS 功率控制与多协议云边交互，实现 EMS、BMS、PCS 三方高效联动，保障储能系统稳定可靠运行。</w:t>
+      </w:r>
+    </w:p>
+    <w:p>
+      <w:pPr>
+        <w:numPr>
+          <w:ilvl w:val="0"/>
+          <w:numId w:val="8"/>
+        </w:numPr>
+        <w:spacing w:line="360" w:lineRule="exact"/>
+        <w:rPr>
+          <w:rFonts w:ascii="微软雅黑" w:eastAsia="微软雅黑" w:hAnsi="微软雅黑" w:cs="微软雅黑"/>
+          <w:b/>
+          <w:bCs/>
+        </w:rPr>
+      </w:pPr>
+      <w:r>
+        <w:rPr>
+          <w:rFonts w:ascii="微软雅黑" w:eastAsia="微软雅黑" w:hAnsi="微软雅黑" w:cs="微软雅黑" w:hint="eastAsia"/>
+          <w:b/>
+          <w:bCs/>
+        </w:rPr>
+        <w:t>工作内容与技术实现：</w:t>
       </w:r>
     </w:p>
     <w:p>
@@ -2304,34 +2236,48 @@
         <w:wordWrap w:val="0"/>
         <w:spacing w:line="360" w:lineRule="exact"/>
         <w:rPr>
-          <w:rFonts w:asciiTheme="minorEastAsia" w:eastAsiaTheme="minorEastAsia" w:hAnsiTheme="minorEastAsia" w:cstheme="minorEastAsia" w:hint="eastAsia"/>
-          <w:kern w:val="0"/>
-          <w:szCs w:val="21"/>
-        </w:rPr>
-      </w:pPr>
-      <w:r>
-        <w:rPr>
-          <w:rFonts w:asciiTheme="minorEastAsia" w:eastAsiaTheme="minorEastAsia" w:hAnsiTheme="minorEastAsia" w:cstheme="minorEastAsia" w:hint="eastAsia"/>
-          <w:b/>
-          <w:bCs/>
-          <w:kern w:val="0"/>
-          <w:szCs w:val="21"/>
-        </w:rPr>
-        <w:t>项目描述：</w:t>
-      </w:r>
-      <w:r>
-        <w:rPr>
-          <w:rFonts w:asciiTheme="minorEastAsia" w:eastAsiaTheme="minorEastAsia" w:hAnsiTheme="minorEastAsia" w:cstheme="minorEastAsia" w:hint="eastAsia"/>
-          <w:kern w:val="0"/>
-          <w:szCs w:val="21"/>
-        </w:rPr>
-        <w:t>负责将原有储能 EMS 核心软件</w:t>
+          <w:rFonts w:asciiTheme="minorEastAsia" w:eastAsiaTheme="minorEastAsia" w:hAnsiTheme="minorEastAsia" w:cstheme="minorEastAsia"/>
+          <w:b/>
+          <w:bCs/>
+          <w:szCs w:val="21"/>
+        </w:rPr>
+      </w:pPr>
+      <w:r>
+        <w:rPr>
+          <w:rFonts w:asciiTheme="minorEastAsia" w:eastAsiaTheme="minorEastAsia" w:hAnsiTheme="minorEastAsia" w:cstheme="minorEastAsia" w:hint="eastAsia"/>
+          <w:b/>
+          <w:bCs/>
+          <w:szCs w:val="21"/>
+        </w:rPr>
+        <w:t>异构多核通信：</w:t>
+      </w:r>
+      <w:r>
+        <w:rPr>
+          <w:rFonts w:asciiTheme="minorEastAsia" w:eastAsiaTheme="minorEastAsia" w:hAnsiTheme="minorEastAsia" w:cstheme="minorEastAsia" w:hint="eastAsia"/>
+          <w:szCs w:val="21"/>
+        </w:rPr>
+        <w:t>基于核间通信机制（RPMSG/IPCC，</w:t>
+      </w:r>
+      <w:proofErr w:type="spellStart"/>
+      <w:r>
+        <w:rPr>
+          <w:rFonts w:asciiTheme="minorEastAsia" w:eastAsiaTheme="minorEastAsia" w:hAnsiTheme="minorEastAsia" w:cstheme="minorEastAsia" w:hint="eastAsia"/>
+          <w:szCs w:val="21"/>
+        </w:rPr>
+        <w:t>iccmsg</w:t>
+      </w:r>
+      <w:proofErr w:type="spellEnd"/>
+      <w:r>
+        <w:rPr>
+          <w:rFonts w:asciiTheme="minorEastAsia" w:eastAsiaTheme="minorEastAsia" w:hAnsiTheme="minorEastAsia" w:cstheme="minorEastAsia" w:hint="eastAsia"/>
+          <w:szCs w:val="21"/>
+        </w:rPr>
+        <w:t xml:space="preserve"> 协议</w:t>
       </w:r>
       <w:proofErr w:type="gramStart"/>
       <w:r>
         <w:rPr>
           <w:rFonts w:asciiTheme="minorEastAsia" w:eastAsiaTheme="minorEastAsia" w:hAnsiTheme="minorEastAsia" w:cstheme="minorEastAsia" w:hint="eastAsia"/>
-          <w:kern w:val="0"/>
           <w:szCs w:val="21"/>
         </w:rPr>
         <w:t>栈</w:t>
@@ -2340,46 +2286,109 @@
       <w:r>
         <w:rPr>
           <w:rFonts w:asciiTheme="minorEastAsia" w:eastAsiaTheme="minorEastAsia" w:hAnsiTheme="minorEastAsia" w:cstheme="minorEastAsia" w:hint="eastAsia"/>
-          <w:kern w:val="0"/>
-          <w:szCs w:val="21"/>
-        </w:rPr>
-        <w:t xml:space="preserve">平滑移植到 </w:t>
+          <w:szCs w:val="21"/>
+        </w:rPr>
+        <w:t>），打通 Linux（A55 核）与 RTOS（R5 核）之间的 BMS 状态数据上报与控制指令下发链路，实现多帧重组</w:t>
+      </w:r>
+      <w:proofErr w:type="gramStart"/>
+      <w:r>
+        <w:rPr>
+          <w:rFonts w:asciiTheme="minorEastAsia" w:eastAsiaTheme="minorEastAsia" w:hAnsiTheme="minorEastAsia" w:cstheme="minorEastAsia" w:hint="eastAsia"/>
+          <w:szCs w:val="21"/>
+        </w:rPr>
+        <w:t>与跨核安全</w:t>
+      </w:r>
+      <w:proofErr w:type="gramEnd"/>
+      <w:r>
+        <w:rPr>
+          <w:rFonts w:asciiTheme="minorEastAsia" w:eastAsiaTheme="minorEastAsia" w:hAnsiTheme="minorEastAsia" w:cstheme="minorEastAsia" w:hint="eastAsia"/>
+          <w:szCs w:val="21"/>
+        </w:rPr>
+        <w:t>交互，多核通信吞吐量与时延均达设计指标。</w:t>
+      </w:r>
+      <w:r>
+        <w:rPr>
+          <w:rFonts w:asciiTheme="minorEastAsia" w:eastAsiaTheme="minorEastAsia" w:hAnsiTheme="minorEastAsia" w:cstheme="minorEastAsia" w:hint="eastAsia"/>
+          <w:b/>
+          <w:bCs/>
+          <w:szCs w:val="21"/>
+        </w:rPr>
+        <w:t>软件架构移植与</w:t>
+      </w:r>
+      <w:proofErr w:type="gramStart"/>
+      <w:r>
+        <w:rPr>
+          <w:rFonts w:asciiTheme="minorEastAsia" w:eastAsiaTheme="minorEastAsia" w:hAnsiTheme="minorEastAsia" w:cstheme="minorEastAsia" w:hint="eastAsia"/>
+          <w:b/>
+          <w:bCs/>
+          <w:szCs w:val="21"/>
+        </w:rPr>
+        <w:t>插件化</w:t>
+      </w:r>
+      <w:proofErr w:type="gramEnd"/>
+      <w:r>
+        <w:rPr>
+          <w:rFonts w:asciiTheme="minorEastAsia" w:eastAsiaTheme="minorEastAsia" w:hAnsiTheme="minorEastAsia" w:cstheme="minorEastAsia" w:hint="eastAsia"/>
+          <w:b/>
+          <w:bCs/>
+          <w:szCs w:val="21"/>
+        </w:rPr>
+        <w:t>改造：</w:t>
+      </w:r>
+      <w:r>
+        <w:rPr>
+          <w:rFonts w:asciiTheme="minorEastAsia" w:eastAsiaTheme="minorEastAsia" w:hAnsiTheme="minorEastAsia" w:cstheme="minorEastAsia" w:hint="eastAsia"/>
+          <w:szCs w:val="21"/>
+        </w:rPr>
+        <w:t>将 EMS 核心</w:t>
+      </w:r>
+      <w:proofErr w:type="gramStart"/>
+      <w:r>
+        <w:rPr>
+          <w:rFonts w:asciiTheme="minorEastAsia" w:eastAsiaTheme="minorEastAsia" w:hAnsiTheme="minorEastAsia" w:cstheme="minorEastAsia" w:hint="eastAsia"/>
+          <w:szCs w:val="21"/>
+        </w:rPr>
+        <w:t>栈</w:t>
+      </w:r>
+      <w:proofErr w:type="gramEnd"/>
+      <w:r>
+        <w:rPr>
+          <w:rFonts w:asciiTheme="minorEastAsia" w:eastAsiaTheme="minorEastAsia" w:hAnsiTheme="minorEastAsia" w:cstheme="minorEastAsia" w:hint="eastAsia"/>
+          <w:szCs w:val="21"/>
+        </w:rPr>
+        <w:t xml:space="preserve">移植至 Linux 系统层，统一函数 HAL 通信抽象接口（Open/Accept/Read/Write/Control/Close），以 </w:t>
       </w:r>
       <w:proofErr w:type="spellStart"/>
       <w:r>
         <w:rPr>
           <w:rFonts w:asciiTheme="minorEastAsia" w:eastAsiaTheme="minorEastAsia" w:hAnsiTheme="minorEastAsia" w:cstheme="minorEastAsia" w:hint="eastAsia"/>
-          <w:kern w:val="0"/>
-          <w:szCs w:val="21"/>
-        </w:rPr>
-        <w:t>SemiDrive</w:t>
+          <w:szCs w:val="21"/>
+        </w:rPr>
+        <w:t>dlsym</w:t>
       </w:r>
       <w:proofErr w:type="spellEnd"/>
       <w:r>
         <w:rPr>
           <w:rFonts w:asciiTheme="minorEastAsia" w:eastAsiaTheme="minorEastAsia" w:hAnsiTheme="minorEastAsia" w:cstheme="minorEastAsia" w:hint="eastAsia"/>
-          <w:kern w:val="0"/>
-          <w:szCs w:val="21"/>
-        </w:rPr>
-        <w:t xml:space="preserve"> D9 新平台，并主导全新储能变流器（PCS，235kW）通信协议与自动管理策略的开发调试。项目采用"采样器 Sampler → 数据中心 DPR → 上报器 Reporter"三层</w:t>
+          <w:szCs w:val="21"/>
+        </w:rPr>
+        <w:t xml:space="preserve"> 动态加载 9 </w:t>
       </w:r>
       <w:proofErr w:type="gramStart"/>
       <w:r>
         <w:rPr>
           <w:rFonts w:asciiTheme="minorEastAsia" w:eastAsiaTheme="minorEastAsia" w:hAnsiTheme="minorEastAsia" w:cstheme="minorEastAsia" w:hint="eastAsia"/>
-          <w:kern w:val="0"/>
-          <w:szCs w:val="21"/>
-        </w:rPr>
-        <w:t>插件化</w:t>
+          <w:szCs w:val="21"/>
+        </w:rPr>
+        <w:t>个</w:t>
       </w:r>
       <w:proofErr w:type="gramEnd"/>
       <w:r>
         <w:rPr>
           <w:rFonts w:asciiTheme="minorEastAsia" w:eastAsiaTheme="minorEastAsia" w:hAnsiTheme="minorEastAsia" w:cstheme="minorEastAsia" w:hint="eastAsia"/>
-          <w:kern w:val="0"/>
-          <w:szCs w:val="21"/>
-        </w:rPr>
-        <w:t>架构，覆盖 BMS 数据采集、EMS 能量管理、PCS 功率控制与多协议云边交互，实现 EMS、BMS、PCS 三方高效联动，保障储能系统稳定可靠运行。</w:t>
+          <w:szCs w:val="21"/>
+        </w:rPr>
+        <w:t>通信模块（CAN、RS485 串口、TCP/IP、UDP、HTTP/FTP、WebSocket、IPC、RPMSG 等）与各采样器/上报器，实现模块解耦与按需加载。</w:t>
       </w:r>
     </w:p>
     <w:p>
@@ -2389,167 +2398,6 @@
         <w:spacing w:line="360" w:lineRule="exact"/>
         <w:rPr>
           <w:rFonts w:asciiTheme="minorEastAsia" w:eastAsiaTheme="minorEastAsia" w:hAnsiTheme="minorEastAsia" w:cstheme="minorEastAsia"/>
-          <w:b/>
-          <w:bCs/>
-          <w:szCs w:val="21"/>
-        </w:rPr>
-      </w:pPr>
-      <w:r>
-        <w:rPr>
-          <w:rFonts w:asciiTheme="minorEastAsia" w:eastAsiaTheme="minorEastAsia" w:hAnsiTheme="minorEastAsia" w:cstheme="minorEastAsia" w:hint="eastAsia"/>
-          <w:b/>
-          <w:bCs/>
-          <w:szCs w:val="21"/>
-        </w:rPr>
-        <w:t>异构多核通信：</w:t>
-      </w:r>
-      <w:r>
-        <w:rPr>
-          <w:rFonts w:asciiTheme="minorEastAsia" w:eastAsiaTheme="minorEastAsia" w:hAnsiTheme="minorEastAsia" w:cstheme="minorEastAsia" w:hint="eastAsia"/>
-          <w:szCs w:val="21"/>
-        </w:rPr>
-        <w:t>基于核间通信机制（RPMSG/IPCC，</w:t>
-      </w:r>
-      <w:proofErr w:type="spellStart"/>
-      <w:r>
-        <w:rPr>
-          <w:rFonts w:asciiTheme="minorEastAsia" w:eastAsiaTheme="minorEastAsia" w:hAnsiTheme="minorEastAsia" w:cstheme="minorEastAsia" w:hint="eastAsia"/>
-          <w:szCs w:val="21"/>
-        </w:rPr>
-        <w:t>iccmsg</w:t>
-      </w:r>
-      <w:proofErr w:type="spellEnd"/>
-      <w:r>
-        <w:rPr>
-          <w:rFonts w:asciiTheme="minorEastAsia" w:eastAsiaTheme="minorEastAsia" w:hAnsiTheme="minorEastAsia" w:cstheme="minorEastAsia" w:hint="eastAsia"/>
-          <w:szCs w:val="21"/>
-        </w:rPr>
-        <w:t xml:space="preserve"> 协议</w:t>
-      </w:r>
-      <w:proofErr w:type="gramStart"/>
-      <w:r>
-        <w:rPr>
-          <w:rFonts w:asciiTheme="minorEastAsia" w:eastAsiaTheme="minorEastAsia" w:hAnsiTheme="minorEastAsia" w:cstheme="minorEastAsia" w:hint="eastAsia"/>
-          <w:szCs w:val="21"/>
-        </w:rPr>
-        <w:t>栈</w:t>
-      </w:r>
-      <w:proofErr w:type="gramEnd"/>
-      <w:r>
-        <w:rPr>
-          <w:rFonts w:asciiTheme="minorEastAsia" w:eastAsiaTheme="minorEastAsia" w:hAnsiTheme="minorEastAsia" w:cstheme="minorEastAsia" w:hint="eastAsia"/>
-          <w:szCs w:val="21"/>
-        </w:rPr>
-        <w:t>），打通 Linux（A55 核）与 RTOS（R5 核）之间的 BMS 状态数据上报与控制指令下发链路，实现多帧重组</w:t>
-      </w:r>
-      <w:proofErr w:type="gramStart"/>
-      <w:r>
-        <w:rPr>
-          <w:rFonts w:asciiTheme="minorEastAsia" w:eastAsiaTheme="minorEastAsia" w:hAnsiTheme="minorEastAsia" w:cstheme="minorEastAsia" w:hint="eastAsia"/>
-          <w:szCs w:val="21"/>
-        </w:rPr>
-        <w:t>与跨核安全</w:t>
-      </w:r>
-      <w:proofErr w:type="gramEnd"/>
-      <w:r>
-        <w:rPr>
-          <w:rFonts w:asciiTheme="minorEastAsia" w:eastAsiaTheme="minorEastAsia" w:hAnsiTheme="minorEastAsia" w:cstheme="minorEastAsia" w:hint="eastAsia"/>
-          <w:szCs w:val="21"/>
-        </w:rPr>
-        <w:t>交互，多核通信吞吐量与时延均达设计指标。</w:t>
-      </w:r>
-      <w:r>
-        <w:rPr>
-          <w:rFonts w:asciiTheme="minorEastAsia" w:eastAsiaTheme="minorEastAsia" w:hAnsiTheme="minorEastAsia" w:cstheme="minorEastAsia" w:hint="eastAsia"/>
-          <w:b/>
-          <w:bCs/>
-          <w:szCs w:val="21"/>
-        </w:rPr>
-        <w:t>软件架构移植与</w:t>
-      </w:r>
-      <w:proofErr w:type="gramStart"/>
-      <w:r>
-        <w:rPr>
-          <w:rFonts w:asciiTheme="minorEastAsia" w:eastAsiaTheme="minorEastAsia" w:hAnsiTheme="minorEastAsia" w:cstheme="minorEastAsia" w:hint="eastAsia"/>
-          <w:b/>
-          <w:bCs/>
-          <w:szCs w:val="21"/>
-        </w:rPr>
-        <w:t>插件化</w:t>
-      </w:r>
-      <w:proofErr w:type="gramEnd"/>
-      <w:r>
-        <w:rPr>
-          <w:rFonts w:asciiTheme="minorEastAsia" w:eastAsiaTheme="minorEastAsia" w:hAnsiTheme="minorEastAsia" w:cstheme="minorEastAsia" w:hint="eastAsia"/>
-          <w:b/>
-          <w:bCs/>
-          <w:szCs w:val="21"/>
-        </w:rPr>
-        <w:t>改造：</w:t>
-      </w:r>
-      <w:r>
-        <w:rPr>
-          <w:rFonts w:asciiTheme="minorEastAsia" w:eastAsiaTheme="minorEastAsia" w:hAnsiTheme="minorEastAsia" w:cstheme="minorEastAsia" w:hint="eastAsia"/>
-          <w:szCs w:val="21"/>
-        </w:rPr>
-        <w:t>将 EMS 核心</w:t>
-      </w:r>
-      <w:proofErr w:type="gramStart"/>
-      <w:r>
-        <w:rPr>
-          <w:rFonts w:asciiTheme="minorEastAsia" w:eastAsiaTheme="minorEastAsia" w:hAnsiTheme="minorEastAsia" w:cstheme="minorEastAsia" w:hint="eastAsia"/>
-          <w:szCs w:val="21"/>
-        </w:rPr>
-        <w:t>栈</w:t>
-      </w:r>
-      <w:proofErr w:type="gramEnd"/>
-      <w:r>
-        <w:rPr>
-          <w:rFonts w:asciiTheme="minorEastAsia" w:eastAsiaTheme="minorEastAsia" w:hAnsiTheme="minorEastAsia" w:cstheme="minorEastAsia" w:hint="eastAsia"/>
-          <w:szCs w:val="21"/>
-        </w:rPr>
-        <w:t xml:space="preserve">移植至 Linux 系统层，统一 6 函数 HAL 通信抽象接口（Open/Accept/Read/Write/Control/Close），以 </w:t>
-      </w:r>
-      <w:proofErr w:type="spellStart"/>
-      <w:r>
-        <w:rPr>
-          <w:rFonts w:asciiTheme="minorEastAsia" w:eastAsiaTheme="minorEastAsia" w:hAnsiTheme="minorEastAsia" w:cstheme="minorEastAsia" w:hint="eastAsia"/>
-          <w:szCs w:val="21"/>
-        </w:rPr>
-        <w:t>dlsym</w:t>
-      </w:r>
-      <w:proofErr w:type="spellEnd"/>
-      <w:r>
-        <w:rPr>
-          <w:rFonts w:asciiTheme="minorEastAsia" w:eastAsiaTheme="minorEastAsia" w:hAnsiTheme="minorEastAsia" w:cstheme="minorEastAsia" w:hint="eastAsia"/>
-          <w:szCs w:val="21"/>
-        </w:rPr>
-        <w:t xml:space="preserve"> 动态加载 9 </w:t>
-      </w:r>
-      <w:proofErr w:type="gramStart"/>
-      <w:r>
-        <w:rPr>
-          <w:rFonts w:asciiTheme="minorEastAsia" w:eastAsiaTheme="minorEastAsia" w:hAnsiTheme="minorEastAsia" w:cstheme="minorEastAsia" w:hint="eastAsia"/>
-          <w:szCs w:val="21"/>
-        </w:rPr>
-        <w:t>个</w:t>
-      </w:r>
-      <w:proofErr w:type="gramEnd"/>
-      <w:r>
-        <w:rPr>
-          <w:rFonts w:asciiTheme="minorEastAsia" w:eastAsiaTheme="minorEastAsia" w:hAnsiTheme="minorEastAsia" w:cstheme="minorEastAsia" w:hint="eastAsia"/>
-          <w:szCs w:val="21"/>
-        </w:rPr>
-        <w:t>通信模块（CAN、RS485 串口、TCP/IP、UDP、HTTP/FTP、WebSocket、IPC、RPMSG 等）与各采样器/上报器，实现模块解耦与按需加载。</w:t>
-      </w:r>
-    </w:p>
-    <w:p>
-      <w:pPr>
-        <w:widowControl/>
-        <w:wordWrap w:val="0"/>
-        <w:spacing w:line="360" w:lineRule="exact"/>
-        <w:rPr>
-          <w:rFonts w:asciiTheme="minorEastAsia" w:eastAsiaTheme="minorEastAsia" w:hAnsiTheme="minorEastAsia" w:cstheme="minorEastAsia"/>
           <w:szCs w:val="21"/>
         </w:rPr>
       </w:pPr>
@@ -2568,82 +2416,6 @@
           <w:szCs w:val="21"/>
         </w:rPr>
         <w:t>主导全新 235kW PCS 通信协议适配（启停、充放电模式切换、功率调节），并实现基于时段计划的自动管理策略——分时电价/功率限额下自动充放电、防逆流充电、防过载放电及 SOC 停止判断，保障功率安全与电池寿命。</w:t>
-      </w:r>
-    </w:p>
-    <w:p>
-      <w:pPr>
-        <w:widowControl/>
-        <w:wordWrap w:val="0"/>
-        <w:spacing w:line="360" w:lineRule="exact"/>
-        <w:rPr>
-          <w:rFonts w:asciiTheme="minorEastAsia" w:eastAsiaTheme="minorEastAsia" w:hAnsiTheme="minorEastAsia" w:cstheme="minorEastAsia"/>
-          <w:kern w:val="0"/>
-          <w:szCs w:val="21"/>
-        </w:rPr>
-      </w:pPr>
-      <w:r>
-        <w:rPr>
-          <w:rFonts w:asciiTheme="minorEastAsia" w:eastAsiaTheme="minorEastAsia" w:hAnsiTheme="minorEastAsia" w:cstheme="minorEastAsia" w:hint="eastAsia"/>
-          <w:b/>
-          <w:bCs/>
-          <w:szCs w:val="21"/>
-        </w:rPr>
-        <w:t>数据管理与系统可靠性：</w:t>
-      </w:r>
-      <w:r>
-        <w:rPr>
-          <w:rFonts w:asciiTheme="minorEastAsia" w:eastAsiaTheme="minorEastAsia" w:hAnsiTheme="minorEastAsia" w:cstheme="minorEastAsia" w:hint="eastAsia"/>
-          <w:szCs w:val="21"/>
-        </w:rPr>
-        <w:t xml:space="preserve">基于 SQLite 构建配置/事件/告警/表达式引擎（DPR 数据中心）；采用 </w:t>
-      </w:r>
-      <w:proofErr w:type="spellStart"/>
-      <w:r>
-        <w:rPr>
-          <w:rFonts w:asciiTheme="minorEastAsia" w:eastAsiaTheme="minorEastAsia" w:hAnsiTheme="minorEastAsia" w:cstheme="minorEastAsia" w:hint="eastAsia"/>
-          <w:szCs w:val="21"/>
-        </w:rPr>
-        <w:t>syshand</w:t>
-      </w:r>
-      <w:proofErr w:type="spellEnd"/>
-      <w:r>
-        <w:rPr>
-          <w:rFonts w:asciiTheme="minorEastAsia" w:eastAsiaTheme="minorEastAsia" w:hAnsiTheme="minorEastAsia" w:cstheme="minorEastAsia" w:hint="eastAsia"/>
-          <w:szCs w:val="21"/>
-        </w:rPr>
-        <w:t xml:space="preserve"> </w:t>
-      </w:r>
-      <w:proofErr w:type="gramStart"/>
-      <w:r>
-        <w:rPr>
-          <w:rFonts w:asciiTheme="minorEastAsia" w:eastAsiaTheme="minorEastAsia" w:hAnsiTheme="minorEastAsia" w:cstheme="minorEastAsia" w:hint="eastAsia"/>
-          <w:szCs w:val="21"/>
-        </w:rPr>
-        <w:t>双进程</w:t>
-      </w:r>
-      <w:proofErr w:type="gramEnd"/>
-      <w:r>
-        <w:rPr>
-          <w:rFonts w:asciiTheme="minorEastAsia" w:eastAsiaTheme="minorEastAsia" w:hAnsiTheme="minorEastAsia" w:cstheme="minorEastAsia" w:hint="eastAsia"/>
-          <w:szCs w:val="21"/>
-        </w:rPr>
-        <w:t>守护 + 硬件看门</w:t>
-      </w:r>
-      <w:proofErr w:type="gramStart"/>
-      <w:r>
-        <w:rPr>
-          <w:rFonts w:asciiTheme="minorEastAsia" w:eastAsiaTheme="minorEastAsia" w:hAnsiTheme="minorEastAsia" w:cstheme="minorEastAsia" w:hint="eastAsia"/>
-          <w:szCs w:val="21"/>
-        </w:rPr>
-        <w:t>狗机制</w:t>
-      </w:r>
-      <w:proofErr w:type="gramEnd"/>
-      <w:r>
-        <w:rPr>
-          <w:rFonts w:asciiTheme="minorEastAsia" w:eastAsiaTheme="minorEastAsia" w:hAnsiTheme="minorEastAsia" w:cstheme="minorEastAsia" w:hint="eastAsia"/>
-          <w:szCs w:val="21"/>
-        </w:rPr>
-        <w:t>保障进程存活；完成 ext4 + dm-verity 完整性校验 + RAUC 签名打包的 OTA 升级链路，保障现场安全可升级。</w:t>
       </w:r>
     </w:p>
     <w:p>
@@ -2652,7 +2424,7 @@
         <w:wordWrap w:val="0"/>
         <w:spacing w:before="0" w:beforeAutospacing="0" w:after="0" w:afterAutospacing="0" w:line="360" w:lineRule="exact"/>
         <w:rPr>
-          <w:rFonts w:asciiTheme="minorEastAsia" w:eastAsiaTheme="minorEastAsia" w:hAnsiTheme="minorEastAsia" w:cstheme="minorEastAsia" w:hint="eastAsia"/>
+          <w:rFonts w:asciiTheme="minorEastAsia" w:eastAsiaTheme="minorEastAsia" w:hAnsiTheme="minorEastAsia" w:cstheme="minorEastAsia"/>
           <w:sz w:val="21"/>
           <w:szCs w:val="21"/>
         </w:rPr>
@@ -2973,11 +2745,11 @@
       </w:r>
       <w:r>
         <w:rPr>
-          <w:rFonts w:asciiTheme="minorEastAsia" w:eastAsiaTheme="minorEastAsia" w:hAnsiTheme="minorEastAsia" w:cstheme="minorEastAsia"/>
-          <w:sz w:val="20"/>
-          <w:szCs w:val="20"/>
-        </w:rPr>
-        <w:t>嵌入式系统及工程应用</w:t>
+          <w:rFonts w:asciiTheme="minorEastAsia" w:eastAsiaTheme="minorEastAsia" w:hAnsiTheme="minorEastAsia" w:cstheme="minorEastAsia" w:hint="eastAsia"/>
+          <w:sz w:val="20"/>
+          <w:szCs w:val="20"/>
+        </w:rPr>
+        <w:t>自动控制原理</w:t>
       </w:r>
       <w:r>
         <w:rPr>
@@ -3077,7 +2849,7 @@
         <w:wordWrap w:val="0"/>
         <w:spacing w:line="360" w:lineRule="exact"/>
         <w:rPr>
-          <w:rFonts w:asciiTheme="minorEastAsia" w:eastAsiaTheme="minorEastAsia" w:hAnsiTheme="minorEastAsia" w:cstheme="minorEastAsia" w:hint="eastAsia"/>
+          <w:rFonts w:asciiTheme="minorEastAsia" w:eastAsiaTheme="minorEastAsia" w:hAnsiTheme="minorEastAsia" w:cstheme="minorEastAsia"/>
           <w:b/>
           <w:bCs/>
           <w:kern w:val="0"/>
@@ -3104,6 +2876,41 @@
           <w:szCs w:val="21"/>
         </w:rPr>
         <w:t xml:space="preserve">   </w:t>
+      </w:r>
+      <w:r>
+        <w:rPr>
+          <w:rFonts w:ascii="黑体" w:eastAsia="黑体" w:hAnsi="黑体"/>
+          <w:szCs w:val="21"/>
+        </w:rPr>
+        <w:t xml:space="preserve">      C</w:t>
+      </w:r>
+      <w:r>
+        <w:rPr>
+          <w:rFonts w:ascii="黑体" w:eastAsia="黑体" w:hAnsi="黑体" w:hint="eastAsia"/>
+          <w:szCs w:val="21"/>
+        </w:rPr>
+        <w:t>ET</w:t>
+      </w:r>
+      <w:r>
+        <w:rPr>
+          <w:rFonts w:ascii="黑体" w:eastAsia="黑体" w:hAnsi="黑体"/>
+          <w:szCs w:val="21"/>
+        </w:rPr>
+        <w:t>-6</w:t>
+      </w:r>
+      <w:r>
+        <w:rPr>
+          <w:rFonts w:ascii="黑体" w:eastAsia="黑体" w:hAnsi="黑体" w:hint="eastAsia"/>
+          <w:szCs w:val="21"/>
+        </w:rPr>
+        <w:t>、</w:t>
+      </w:r>
+      <w:r>
+        <w:rPr>
+          <w:rFonts w:ascii="黑体" w:eastAsia="黑体" w:hAnsi="黑体"/>
+          <w:szCs w:val="21"/>
+        </w:rPr>
+        <w:t xml:space="preserve">             </w:t>
       </w:r>
       <w:r>
         <w:rPr>
@@ -3154,27 +2961,6 @@
         </w:rPr>
         <w:tab/>
         <w:t xml:space="preserve">    </w:t>
-      </w:r>
-      <w:r>
-        <w:rPr>
-          <w:rFonts w:ascii="黑体" w:eastAsia="黑体" w:hAnsi="黑体"/>
-          <w:szCs w:val="21"/>
-        </w:rPr>
-        <w:t>C</w:t>
-      </w:r>
-      <w:r>
-        <w:rPr>
-          <w:rFonts w:ascii="黑体" w:eastAsia="黑体" w:hAnsi="黑体" w:hint="eastAsia"/>
-          <w:szCs w:val="21"/>
-        </w:rPr>
-        <w:t>ET</w:t>
-      </w:r>
-      <w:r>
-        <w:rPr>
-          <w:rFonts w:ascii="黑体" w:eastAsia="黑体" w:hAnsi="黑体"/>
-          <w:szCs w:val="21"/>
-        </w:rPr>
-        <w:t>-6</w:t>
       </w:r>
     </w:p>
     <w:tbl>
@@ -3218,26 +3004,7 @@
                 <w:color w:val="538CD5"/>
                 <w:sz w:val="28"/>
               </w:rPr>
-              <w:lastRenderedPageBreak/>
-              <w:t>自</w:t>
-            </w:r>
-            <w:r>
-              <w:rPr>
-                <w:rFonts w:ascii="微软雅黑" w:eastAsia="微软雅黑" w:hAnsi="微软雅黑" w:cs="Times New Roman" w:hint="eastAsia"/>
-                <w:b/>
-                <w:color w:val="538CD5"/>
-                <w:sz w:val="28"/>
-              </w:rPr>
-              <w:t>我评价</w:t>
-            </w:r>
-            <w:r>
-              <w:rPr>
-                <w:rFonts w:ascii="微软雅黑" w:eastAsia="微软雅黑" w:hAnsi="微软雅黑" w:cs="Times New Roman" w:hint="eastAsia"/>
-                <w:b/>
-                <w:color w:val="538CD5"/>
-                <w:sz w:val="28"/>
-              </w:rPr>
-              <w:t>:</w:t>
+              <w:t>自我评价:</w:t>
             </w:r>
           </w:p>
         </w:tc>
@@ -3280,28 +3047,95 @@
           <w:rFonts w:ascii="宋体" w:hAnsi="宋体" w:cs="宋体" w:hint="eastAsia"/>
           <w:szCs w:val="21"/>
         </w:rPr>
-        <w:t>本人对待工作学习认真严谨、学习能力强。在校获得过奖学金，在专业课的课程设计中经常指导和帮助同学解决一些技术困难。遇到超出课程知识内容，会提前自主学习。</w:t>
-      </w:r>
-    </w:p>
-    <w:p>
-      <w:pPr>
-        <w:widowControl/>
-        <w:numPr>
-          <w:ilvl w:val="0"/>
-          <w:numId w:val="6"/>
-        </w:numPr>
-        <w:spacing w:line="360" w:lineRule="exact"/>
+        <w:t>本人对待工作学习认真严谨、学习能力强</w:t>
+      </w:r>
+      <w:r>
+        <w:rPr>
+          <w:rFonts w:ascii="宋体" w:hAnsi="宋体" w:cs="宋体" w:hint="eastAsia"/>
+          <w:szCs w:val="21"/>
+        </w:rPr>
+        <w:t>，</w:t>
+      </w:r>
+      <w:r>
+        <w:rPr>
+          <w:rFonts w:ascii="宋体" w:hAnsi="宋体" w:cs="宋体" w:hint="eastAsia"/>
+          <w:szCs w:val="21"/>
+        </w:rPr>
+        <w:t>具备较强的自我学习与自我驱动能力，能适应高强度研发节奏；注重团队协作，善于跨岗位沟通。技术</w:t>
+      </w:r>
+      <w:proofErr w:type="gramStart"/>
+      <w:r>
+        <w:rPr>
+          <w:rFonts w:ascii="宋体" w:hAnsi="宋体" w:cs="宋体" w:hint="eastAsia"/>
+          <w:szCs w:val="21"/>
+        </w:rPr>
+        <w:t>栈</w:t>
+      </w:r>
+      <w:proofErr w:type="gramEnd"/>
+      <w:r>
+        <w:rPr>
+          <w:rFonts w:ascii="宋体" w:hAnsi="宋体" w:cs="宋体" w:hint="eastAsia"/>
+          <w:szCs w:val="21"/>
+        </w:rPr>
+        <w:t>覆盖</w:t>
+      </w:r>
+      <w:r>
         <w:rPr>
           <w:rFonts w:ascii="宋体" w:hAnsi="宋体" w:cs="宋体"/>
           <w:szCs w:val="21"/>
         </w:rPr>
-      </w:pPr>
+        <w:t>ARM Linux</w:t>
+      </w:r>
       <w:r>
         <w:rPr>
           <w:rFonts w:ascii="宋体" w:hAnsi="宋体" w:cs="宋体" w:hint="eastAsia"/>
           <w:szCs w:val="21"/>
         </w:rPr>
-        <w:t>适应能力强、具备团队合作精神和能力。参加和组织过专业技能竞赛和其他活动，懂得如何分工、如何和队友合作。</w:t>
+        <w:t>系统移植、多核异构通信、工业总线协议及嵌入式</w:t>
+      </w:r>
+      <w:r>
+        <w:rPr>
+          <w:rFonts w:ascii="宋体" w:hAnsi="宋体" w:cs="宋体"/>
+          <w:szCs w:val="21"/>
+        </w:rPr>
+        <w:t>Web</w:t>
+      </w:r>
+      <w:r>
+        <w:rPr>
+          <w:rFonts w:ascii="宋体" w:hAnsi="宋体" w:cs="宋体" w:hint="eastAsia"/>
+          <w:szCs w:val="21"/>
+        </w:rPr>
+        <w:t>后端，拥有从零搭建高可靠分层</w:t>
+      </w:r>
+      <w:proofErr w:type="gramStart"/>
+      <w:r>
+        <w:rPr>
+          <w:rFonts w:ascii="宋体" w:hAnsi="宋体" w:cs="宋体" w:hint="eastAsia"/>
+          <w:szCs w:val="21"/>
+        </w:rPr>
+        <w:t>插件化</w:t>
+      </w:r>
+      <w:proofErr w:type="gramEnd"/>
+      <w:r>
+        <w:rPr>
+          <w:rFonts w:ascii="宋体" w:hAnsi="宋体" w:cs="宋体"/>
+          <w:szCs w:val="21"/>
+        </w:rPr>
+        <w:t>EMS</w:t>
+      </w:r>
+      <w:r>
+        <w:rPr>
+          <w:rFonts w:ascii="宋体" w:hAnsi="宋体" w:cs="宋体" w:hint="eastAsia"/>
+          <w:szCs w:val="21"/>
+        </w:rPr>
+        <w:t>软件架构的实战经验</w:t>
+      </w:r>
+      <w:r>
+        <w:rPr>
+          <w:rFonts w:ascii="宋体" w:hAnsi="宋体" w:cs="宋体" w:hint="eastAsia"/>
+          <w:szCs w:val="21"/>
+        </w:rPr>
+        <w:t>，适应能力强、具备团队合作精神和能力。</w:t>
       </w:r>
     </w:p>
     <w:sectPr>
@@ -3375,12 +3209,31 @@
         <v:path o:extrusionok="f" gradientshapeok="t" o:connecttype="rect"/>
         <o:lock v:ext="edit" aspectratio="t"/>
       </v:shapetype>
-      <v:shape id="_x0000_i1383" type="#_x0000_t75" style="width:768.15pt;height:768.15pt" o:bullet="t">
+      <v:shape id="_x0000_i1072" type="#_x0000_t75" style="width:768.15pt;height:768.15pt" o:bullet="t">
         <v:imagedata r:id="rId1" o:title=""/>
       </v:shape>
     </w:pict>
   </w:numPicBullet>
   <w:abstractNum w:abstractNumId="0" w15:restartNumberingAfterBreak="0">
+    <w:nsid w:val="83F61DF6"/>
+    <w:multiLevelType w:val="singleLevel"/>
+    <w:tmpl w:val="83F61DF6"/>
+    <w:lvl w:ilvl="0">
+      <w:start w:val="1"/>
+      <w:numFmt w:val="bullet"/>
+      <w:lvlText w:val=""/>
+      <w:lvlJc w:val="left"/>
+      <w:pPr>
+        <w:ind w:left="420" w:hanging="420"/>
+      </w:pPr>
+      <w:rPr>
+        <w:rFonts w:ascii="Wingdings" w:hAnsi="Wingdings" w:hint="default"/>
+        <w:sz w:val="16"/>
+        <w:szCs w:val="16"/>
+      </w:rPr>
+    </w:lvl>
+  </w:abstractNum>
+  <w:abstractNum w:abstractNumId="1" w15:restartNumberingAfterBreak="0">
     <w:nsid w:val="B014D751"/>
     <w:multiLevelType w:val="singleLevel"/>
     <w:tmpl w:val="B014D751"/>
@@ -3398,7 +3251,7 @@
       </w:rPr>
     </w:lvl>
   </w:abstractNum>
-  <w:abstractNum w:abstractNumId="1" w15:restartNumberingAfterBreak="0">
+  <w:abstractNum w:abstractNumId="2" w15:restartNumberingAfterBreak="0">
     <w:nsid w:val="06B9429A"/>
     <w:multiLevelType w:val="singleLevel"/>
     <w:tmpl w:val="06B9429A"/>
@@ -3415,7 +3268,7 @@
       </w:rPr>
     </w:lvl>
   </w:abstractNum>
-  <w:abstractNum w:abstractNumId="2" w15:restartNumberingAfterBreak="0">
+  <w:abstractNum w:abstractNumId="3" w15:restartNumberingAfterBreak="0">
     <w:nsid w:val="255F765B"/>
     <w:multiLevelType w:val="multilevel"/>
     <w:tmpl w:val="255F765B"/>
@@ -3501,7 +3354,7 @@
       </w:pPr>
     </w:lvl>
   </w:abstractNum>
-  <w:abstractNum w:abstractNumId="3" w15:restartNumberingAfterBreak="0">
+  <w:abstractNum w:abstractNumId="4" w15:restartNumberingAfterBreak="0">
     <w:nsid w:val="2D9D97A2"/>
     <w:multiLevelType w:val="singleLevel"/>
     <w:tmpl w:val="2D9D97A2"/>
@@ -3519,7 +3372,7 @@
       </w:rPr>
     </w:lvl>
   </w:abstractNum>
-  <w:abstractNum w:abstractNumId="4" w15:restartNumberingAfterBreak="0">
+  <w:abstractNum w:abstractNumId="5" w15:restartNumberingAfterBreak="0">
     <w:nsid w:val="35395CAE"/>
     <w:multiLevelType w:val="singleLevel"/>
     <w:tmpl w:val="35395CAE"/>
@@ -3538,7 +3391,7 @@
       </w:rPr>
     </w:lvl>
   </w:abstractNum>
-  <w:abstractNum w:abstractNumId="5" w15:restartNumberingAfterBreak="0">
+  <w:abstractNum w:abstractNumId="6" w15:restartNumberingAfterBreak="0">
     <w:nsid w:val="3AF2996F"/>
     <w:multiLevelType w:val="singleLevel"/>
     <w:tmpl w:val="3AF2996F"/>
@@ -3555,7 +3408,7 @@
       </w:rPr>
     </w:lvl>
   </w:abstractNum>
-  <w:abstractNum w:abstractNumId="6" w15:restartNumberingAfterBreak="0">
+  <w:abstractNum w:abstractNumId="7" w15:restartNumberingAfterBreak="0">
     <w:nsid w:val="6C6C2D95"/>
     <w:multiLevelType w:val="multilevel"/>
     <w:tmpl w:val="6C6C2D95"/>
@@ -3669,25 +3522,28 @@
     </w:lvl>
   </w:abstractNum>
   <w:num w:numId="1">
+    <w:abstractNumId w:val="3"/>
+  </w:num>
+  <w:num w:numId="2">
+    <w:abstractNumId w:val="4"/>
+  </w:num>
+  <w:num w:numId="3">
+    <w:abstractNumId w:val="7"/>
+  </w:num>
+  <w:num w:numId="4">
+    <w:abstractNumId w:val="1"/>
+  </w:num>
+  <w:num w:numId="5">
+    <w:abstractNumId w:val="6"/>
+  </w:num>
+  <w:num w:numId="6">
     <w:abstractNumId w:val="2"/>
   </w:num>
-  <w:num w:numId="2">
-    <w:abstractNumId w:val="3"/>
-  </w:num>
-  <w:num w:numId="3">
-    <w:abstractNumId w:val="6"/>
-  </w:num>
-  <w:num w:numId="4">
-    <w:abstractNumId w:val="0"/>
-  </w:num>
-  <w:num w:numId="5">
+  <w:num w:numId="7">
     <w:abstractNumId w:val="5"/>
   </w:num>
-  <w:num w:numId="6">
-    <w:abstractNumId w:val="1"/>
-  </w:num>
-  <w:num w:numId="7">
-    <w:abstractNumId w:val="4"/>
+  <w:num w:numId="8">
+    <w:abstractNumId w:val="0"/>
   </w:num>
 </w:numbering>
 </file>
@@ -4119,6 +3975,7 @@
   <w:style w:type="character" w:default="1" w:styleId="a0">
     <w:name w:val="Default Paragraph Font"/>
     <w:uiPriority w:val="1"/>
+    <w:semiHidden/>
     <w:unhideWhenUsed/>
   </w:style>
   <w:style w:type="table" w:default="1" w:styleId="a1">

</xml_diff>